<commit_message>
docs(anteproyecto): update project proposal
</commit_message>
<xml_diff>
--- a/docs/MiW.TFM.Anteproyecto.AnexoI.docx
+++ b/docs/MiW.TFM.Anteproyecto.AnexoI.docx
@@ -216,7 +216,6 @@
                 <w:rFonts w:ascii="Times New Roman" w:hAnsi="Times New Roman"/>
                 <w:sz w:val="24"/>
                 <w:szCs w:val="24"/>
-                <w:lang w:val="es-ES"/>
               </w:rPr>
             </w:pPr>
           </w:p>
@@ -258,7 +257,23 @@
                 <w:sz w:val="24"/>
                 <w:szCs w:val="24"/>
               </w:rPr>
-              <w:t>movil</w:t>
+              <w:t>m</w:t>
+            </w:r>
+            <w:r>
+              <w:rPr>
+                <w:rFonts w:ascii="Times New Roman" w:hAnsi="Times New Roman"/>
+                <w:sz w:val="24"/>
+                <w:szCs w:val="24"/>
+              </w:rPr>
+              <w:t>ó</w:t>
+            </w:r>
+            <w:r>
+              <w:rPr>
+                <w:rFonts w:ascii="Times New Roman" w:hAnsi="Times New Roman"/>
+                <w:sz w:val="24"/>
+                <w:szCs w:val="24"/>
+              </w:rPr>
+              <w:t>vil</w:t>
             </w:r>
             <w:proofErr w:type="spellEnd"/>
             <w:r>
@@ -339,7 +354,7 @@
                 <w:sz w:val="24"/>
                 <w:szCs w:val="24"/>
               </w:rPr>
-              <w:t xml:space="preserve">, </w:t>
+              <w:t xml:space="preserve"> y </w:t>
             </w:r>
             <w:proofErr w:type="spellStart"/>
             <w:r>
@@ -348,43 +363,23 @@
                 <w:sz w:val="24"/>
                 <w:szCs w:val="24"/>
               </w:rPr>
-              <w:t>recursos</w:t>
-            </w:r>
-            <w:proofErr w:type="spellEnd"/>
-            <w:r>
-              <w:rPr>
-                <w:rFonts w:ascii="Times New Roman" w:hAnsi="Times New Roman"/>
-                <w:sz w:val="24"/>
-                <w:szCs w:val="24"/>
-              </w:rPr>
-              <w:t xml:space="preserve"> </w:t>
-            </w:r>
-            <w:proofErr w:type="spellStart"/>
-            <w:r>
-              <w:rPr>
-                <w:rFonts w:ascii="Times New Roman" w:hAnsi="Times New Roman"/>
-                <w:sz w:val="24"/>
-                <w:szCs w:val="24"/>
-              </w:rPr>
-              <w:t>educativos</w:t>
-            </w:r>
-            <w:proofErr w:type="spellEnd"/>
-            <w:r>
-              <w:rPr>
-                <w:rFonts w:ascii="Times New Roman" w:hAnsi="Times New Roman"/>
-                <w:sz w:val="24"/>
-                <w:szCs w:val="24"/>
-              </w:rPr>
-              <w:t xml:space="preserve"> y </w:t>
-            </w:r>
-            <w:proofErr w:type="spellStart"/>
-            <w:r>
-              <w:rPr>
-                <w:rFonts w:ascii="Times New Roman" w:hAnsi="Times New Roman"/>
-                <w:sz w:val="24"/>
-                <w:szCs w:val="24"/>
-              </w:rPr>
-              <w:t>gamificacion</w:t>
+              <w:t>gamificaci</w:t>
+            </w:r>
+            <w:r>
+              <w:rPr>
+                <w:rFonts w:ascii="Times New Roman" w:hAnsi="Times New Roman"/>
+                <w:sz w:val="24"/>
+                <w:szCs w:val="24"/>
+              </w:rPr>
+              <w:t>ó</w:t>
+            </w:r>
+            <w:r>
+              <w:rPr>
+                <w:rFonts w:ascii="Times New Roman" w:hAnsi="Times New Roman"/>
+                <w:sz w:val="24"/>
+                <w:szCs w:val="24"/>
+              </w:rPr>
+              <w:t>n</w:t>
             </w:r>
             <w:proofErr w:type="spellEnd"/>
           </w:p>
@@ -804,8 +799,37 @@
                 <w:szCs w:val="24"/>
                 <w:lang w:val="es-ES"/>
               </w:rPr>
-              <w:t>Consolidar</w:t>
-            </w:r>
+              <w:t xml:space="preserve">Consolidar </w:t>
+            </w:r>
+            <w:r>
+              <w:rPr>
+                <w:rFonts w:ascii="Times New Roman" w:hAnsi="Times New Roman"/>
+                <w:sz w:val="24"/>
+                <w:szCs w:val="24"/>
+                <w:lang w:val="es-ES"/>
+              </w:rPr>
+              <w:t>la</w:t>
+            </w:r>
+            <w:r>
+              <w:rPr>
+                <w:rFonts w:ascii="Times New Roman" w:hAnsi="Times New Roman"/>
+                <w:sz w:val="24"/>
+                <w:szCs w:val="24"/>
+                <w:lang w:val="es-ES"/>
+              </w:rPr>
+              <w:t xml:space="preserve"> solución tecnológica </w:t>
+            </w:r>
+            <w:proofErr w:type="spellStart"/>
+            <w:r>
+              <w:rPr>
+                <w:rFonts w:ascii="Times New Roman" w:hAnsi="Times New Roman"/>
+                <w:sz w:val="24"/>
+                <w:szCs w:val="24"/>
+                <w:lang w:val="es-ES"/>
+              </w:rPr>
+              <w:t>CRIApp</w:t>
+            </w:r>
+            <w:proofErr w:type="spellEnd"/>
             <w:r>
               <w:rPr>
                 <w:rFonts w:ascii="Times New Roman" w:hAnsi="Times New Roman"/>
@@ -822,79 +846,7 @@
                 <w:szCs w:val="24"/>
                 <w:lang w:val="es-ES"/>
               </w:rPr>
-              <w:t xml:space="preserve">una </w:t>
-            </w:r>
-            <w:r>
-              <w:rPr>
-                <w:rFonts w:ascii="Times New Roman" w:hAnsi="Times New Roman"/>
-                <w:sz w:val="24"/>
-                <w:szCs w:val="24"/>
-                <w:lang w:val="es-ES"/>
-              </w:rPr>
-              <w:t>solución</w:t>
-            </w:r>
-            <w:r>
-              <w:rPr>
-                <w:rFonts w:ascii="Times New Roman" w:hAnsi="Times New Roman"/>
-                <w:sz w:val="24"/>
-                <w:szCs w:val="24"/>
-                <w:lang w:val="es-ES"/>
-              </w:rPr>
-              <w:t xml:space="preserve"> </w:t>
-            </w:r>
-            <w:r>
-              <w:rPr>
-                <w:rFonts w:ascii="Times New Roman" w:hAnsi="Times New Roman"/>
-                <w:sz w:val="24"/>
-                <w:szCs w:val="24"/>
-                <w:lang w:val="es-ES"/>
-              </w:rPr>
-              <w:t>tecnológica</w:t>
-            </w:r>
-            <w:r>
-              <w:rPr>
-                <w:rFonts w:ascii="Times New Roman" w:hAnsi="Times New Roman"/>
-                <w:sz w:val="24"/>
-                <w:szCs w:val="24"/>
-                <w:lang w:val="es-ES"/>
-              </w:rPr>
-              <w:t xml:space="preserve"> compuesta por una web API y una </w:t>
-            </w:r>
-            <w:r>
-              <w:rPr>
-                <w:rFonts w:ascii="Times New Roman" w:hAnsi="Times New Roman"/>
-                <w:sz w:val="24"/>
-                <w:szCs w:val="24"/>
-                <w:lang w:val="es-ES"/>
-              </w:rPr>
-              <w:t>aplicación</w:t>
-            </w:r>
-            <w:r>
-              <w:rPr>
-                <w:rFonts w:ascii="Times New Roman" w:hAnsi="Times New Roman"/>
-                <w:sz w:val="24"/>
-                <w:szCs w:val="24"/>
-                <w:lang w:val="es-ES"/>
-              </w:rPr>
-              <w:t xml:space="preserve"> Android que apoye a familias en procesos de crianza, facilitando el seguimiento de respuestas, acceso a recursos educativos y </w:t>
-            </w:r>
-            <w:r>
-              <w:rPr>
-                <w:rFonts w:ascii="Times New Roman" w:hAnsi="Times New Roman"/>
-                <w:sz w:val="24"/>
-                <w:szCs w:val="24"/>
-                <w:lang w:val="es-ES"/>
-              </w:rPr>
-              <w:t>participación</w:t>
-            </w:r>
-            <w:r>
-              <w:rPr>
-                <w:rFonts w:ascii="Times New Roman" w:hAnsi="Times New Roman"/>
-                <w:sz w:val="24"/>
-                <w:szCs w:val="24"/>
-                <w:lang w:val="es-ES"/>
-              </w:rPr>
-              <w:t xml:space="preserve"> comunitaria.</w:t>
+              <w:t>compuesta por una web API y una aplicación Android que apoye a familias en procesos de crianza, facilitando el seguimiento de respuestas, acceso a recursos educativos y participación comunitaria.</w:t>
             </w:r>
           </w:p>
           <w:p>
@@ -1053,7 +1005,25 @@
                 <w:szCs w:val="24"/>
                 <w:lang w:val="pt-ES"/>
               </w:rPr>
-              <w:t>Finalizar los flujos pendientes de premios, notificaciones, recursos audiovisuales y FAQ</w:t>
+              <w:t>Finalizar los flujos pendientes de premios</w:t>
+            </w:r>
+            <w:r>
+              <w:rPr>
+                <w:rFonts w:ascii="Times New Roman" w:hAnsi="Times New Roman"/>
+                <w:sz w:val="24"/>
+                <w:szCs w:val="24"/>
+                <w:lang w:val="pt-ES"/>
+              </w:rPr>
+              <w:t xml:space="preserve"> y</w:t>
+            </w:r>
+            <w:r>
+              <w:rPr>
+                <w:rFonts w:ascii="Times New Roman" w:hAnsi="Times New Roman"/>
+                <w:sz w:val="24"/>
+                <w:szCs w:val="24"/>
+                <w:lang w:val="pt-ES"/>
+              </w:rPr>
+              <w:t xml:space="preserve"> notificaciones</w:t>
             </w:r>
           </w:p>
           <w:p>
@@ -1118,7 +1088,25 @@
                 <w:szCs w:val="24"/>
                 <w:lang w:val="pt-ES"/>
               </w:rPr>
-              <w:t xml:space="preserve"> mantenibilidad, robustez y testabilidad</w:t>
+              <w:t xml:space="preserve"> mantenibilidad</w:t>
+            </w:r>
+            <w:r>
+              <w:rPr>
+                <w:rFonts w:ascii="Times New Roman" w:hAnsi="Times New Roman"/>
+                <w:sz w:val="24"/>
+                <w:szCs w:val="24"/>
+                <w:lang w:val="pt-ES"/>
+              </w:rPr>
+              <w:t xml:space="preserve"> y </w:t>
+            </w:r>
+            <w:r>
+              <w:rPr>
+                <w:rFonts w:ascii="Times New Roman" w:hAnsi="Times New Roman"/>
+                <w:sz w:val="24"/>
+                <w:szCs w:val="24"/>
+                <w:lang w:val="pt-ES"/>
+              </w:rPr>
+              <w:t>robustez</w:t>
             </w:r>
           </w:p>
           <w:p>
@@ -1167,33 +1155,6 @@
               </w:rPr>
               <w:t>la API</w:t>
             </w:r>
-            <w:r>
-              <w:rPr>
-                <w:rFonts w:ascii="Times New Roman" w:hAnsi="Times New Roman"/>
-                <w:sz w:val="24"/>
-                <w:szCs w:val="24"/>
-                <w:lang w:val="pt-ES"/>
-              </w:rPr>
-              <w:t xml:space="preserve"> y</w:t>
-            </w:r>
-            <w:r>
-              <w:rPr>
-                <w:rFonts w:ascii="Times New Roman" w:hAnsi="Times New Roman"/>
-                <w:sz w:val="24"/>
-                <w:szCs w:val="24"/>
-                <w:lang w:val="pt-ES"/>
-              </w:rPr>
-              <w:t xml:space="preserve"> la App</w:t>
-            </w:r>
-            <w:r>
-              <w:rPr>
-                <w:rFonts w:ascii="Times New Roman" w:hAnsi="Times New Roman"/>
-                <w:sz w:val="24"/>
-                <w:szCs w:val="24"/>
-                <w:lang w:val="pt-ES"/>
-              </w:rPr>
-              <w:t xml:space="preserve"> Android</w:t>
-            </w:r>
           </w:p>
           <w:p>
             <w:pPr>
@@ -1223,39 +1184,6 @@
               </w:rPr>
               <w:t>Desplegar la API en una plataforma cloud</w:t>
             </w:r>
-            <w:r>
-              <w:rPr>
-                <w:rFonts w:ascii="Times New Roman" w:hAnsi="Times New Roman"/>
-                <w:sz w:val="24"/>
-                <w:szCs w:val="24"/>
-                <w:lang w:val="pt-ES"/>
-              </w:rPr>
-              <w:t xml:space="preserve"> </w:t>
-            </w:r>
-            <w:r>
-              <w:rPr>
-                <w:rFonts w:ascii="Times New Roman" w:hAnsi="Times New Roman"/>
-                <w:sz w:val="24"/>
-                <w:szCs w:val="24"/>
-                <w:lang w:val="pt-ES"/>
-              </w:rPr>
-              <w:t>para validar su viabilidad operativa</w:t>
-            </w:r>
-          </w:p>
-          <w:p>
-            <w:pPr>
-              <w:widowControl w:val="0"/>
-              <w:autoSpaceDE w:val="0"/>
-              <w:autoSpaceDN w:val="0"/>
-              <w:adjustRightInd w:val="0"/>
-              <w:spacing w:after="0" w:line="200" w:lineRule="exact"/>
-              <w:rPr>
-                <w:rFonts w:ascii="Times New Roman" w:hAnsi="Times New Roman"/>
-                <w:sz w:val="24"/>
-                <w:szCs w:val="24"/>
-                <w:lang w:val="pt-ES"/>
-              </w:rPr>
-            </w:pPr>
           </w:p>
         </w:tc>
       </w:tr>
@@ -1336,43 +1264,7 @@
                 <w:szCs w:val="24"/>
                 <w:lang w:val="es-ES"/>
               </w:rPr>
-              <w:t xml:space="preserve"> es una propuesta de apoyo digital a la crianza inspirada en </w:t>
-            </w:r>
-            <w:r>
-              <w:rPr>
-                <w:rFonts w:ascii="Times New Roman" w:hAnsi="Times New Roman"/>
-                <w:sz w:val="24"/>
-                <w:szCs w:val="24"/>
-                <w:lang w:val="es-ES"/>
-              </w:rPr>
-              <w:t>mecánicas</w:t>
-            </w:r>
-            <w:r>
-              <w:rPr>
-                <w:rFonts w:ascii="Times New Roman" w:hAnsi="Times New Roman"/>
-                <w:sz w:val="24"/>
-                <w:szCs w:val="24"/>
-                <w:lang w:val="es-ES"/>
-              </w:rPr>
-              <w:t xml:space="preserve"> de aprendizaje guiado y </w:t>
-            </w:r>
-            <w:r>
-              <w:rPr>
-                <w:rFonts w:ascii="Times New Roman" w:hAnsi="Times New Roman"/>
-                <w:sz w:val="24"/>
-                <w:szCs w:val="24"/>
-                <w:lang w:val="es-ES"/>
-              </w:rPr>
-              <w:t>retroalimentación</w:t>
-            </w:r>
-            <w:r>
-              <w:rPr>
-                <w:rFonts w:ascii="Times New Roman" w:hAnsi="Times New Roman"/>
-                <w:sz w:val="24"/>
-                <w:szCs w:val="24"/>
-                <w:lang w:val="es-ES"/>
-              </w:rPr>
-              <w:t xml:space="preserve"> continua. El sistema se estructura en dos componentes principales: una API </w:t>
+              <w:t xml:space="preserve"> es una propuesta de apoyo digital a la crianza inspirada en mecánicas de aprendizaje guiado y retroalimentación continua. El sistema se estructura en dos componentes principales: una API </w:t>
             </w:r>
             <w:r>
               <w:rPr>
@@ -1410,45 +1302,25 @@
                 <w:szCs w:val="24"/>
                 <w:lang w:val="es-ES"/>
               </w:rPr>
-              <w:t xml:space="preserve"> para centralizar </w:t>
-            </w:r>
-            <w:r>
-              <w:rPr>
-                <w:rFonts w:ascii="Times New Roman" w:hAnsi="Times New Roman"/>
-                <w:sz w:val="24"/>
-                <w:szCs w:val="24"/>
-                <w:lang w:val="es-ES"/>
-              </w:rPr>
-              <w:t>lógica</w:t>
-            </w:r>
-            <w:r>
-              <w:rPr>
-                <w:rFonts w:ascii="Times New Roman" w:hAnsi="Times New Roman"/>
-                <w:sz w:val="24"/>
-                <w:szCs w:val="24"/>
-                <w:lang w:val="es-ES"/>
-              </w:rPr>
-              <w:t xml:space="preserve"> de negocio y persistencia de datos, y una </w:t>
-            </w:r>
-            <w:proofErr w:type="gramStart"/>
-            <w:r>
-              <w:rPr>
-                <w:rFonts w:ascii="Times New Roman" w:hAnsi="Times New Roman"/>
-                <w:sz w:val="24"/>
-                <w:szCs w:val="24"/>
-                <w:lang w:val="es-ES"/>
-              </w:rPr>
-              <w:t>app</w:t>
-            </w:r>
-            <w:proofErr w:type="gramEnd"/>
-            <w:r>
-              <w:rPr>
-                <w:rFonts w:ascii="Times New Roman" w:hAnsi="Times New Roman"/>
-                <w:sz w:val="24"/>
-                <w:szCs w:val="24"/>
-                <w:lang w:val="es-ES"/>
-              </w:rPr>
-              <w:t xml:space="preserve"> Android </w:t>
+              <w:t xml:space="preserve"> para centralizar lógica de negocio y persistencia de datos, y una </w:t>
+            </w:r>
+            <w:r>
+              <w:rPr>
+                <w:rFonts w:ascii="Times New Roman" w:hAnsi="Times New Roman"/>
+                <w:sz w:val="24"/>
+                <w:szCs w:val="24"/>
+                <w:lang w:val="es-ES"/>
+              </w:rPr>
+              <w:t>A</w:t>
+            </w:r>
+            <w:r>
+              <w:rPr>
+                <w:rFonts w:ascii="Times New Roman" w:hAnsi="Times New Roman"/>
+                <w:sz w:val="24"/>
+                <w:szCs w:val="24"/>
+                <w:lang w:val="es-ES"/>
+              </w:rPr>
+              <w:t xml:space="preserve">pp Android </w:t>
             </w:r>
             <w:r>
               <w:rPr>
@@ -1563,61 +1435,43 @@
                 <w:szCs w:val="24"/>
                 <w:lang w:val="es-ES"/>
               </w:rPr>
-              <w:t xml:space="preserve"> incluye </w:t>
-            </w:r>
-            <w:r>
-              <w:rPr>
-                <w:rFonts w:ascii="Times New Roman" w:hAnsi="Times New Roman"/>
-                <w:sz w:val="24"/>
-                <w:szCs w:val="24"/>
-                <w:lang w:val="es-ES"/>
-              </w:rPr>
-              <w:t>autenticación</w:t>
-            </w:r>
-            <w:r>
-              <w:rPr>
-                <w:rFonts w:ascii="Times New Roman" w:hAnsi="Times New Roman"/>
-                <w:sz w:val="24"/>
-                <w:szCs w:val="24"/>
-                <w:lang w:val="es-ES"/>
-              </w:rPr>
-              <w:t xml:space="preserve"> de usuarios, </w:t>
-            </w:r>
-            <w:r>
-              <w:rPr>
-                <w:rFonts w:ascii="Times New Roman" w:hAnsi="Times New Roman"/>
-                <w:sz w:val="24"/>
-                <w:szCs w:val="24"/>
-                <w:lang w:val="es-ES"/>
-              </w:rPr>
-              <w:t>gestión</w:t>
-            </w:r>
-            <w:r>
-              <w:rPr>
-                <w:rFonts w:ascii="Times New Roman" w:hAnsi="Times New Roman"/>
-                <w:sz w:val="24"/>
-                <w:szCs w:val="24"/>
-                <w:lang w:val="es-ES"/>
-              </w:rPr>
-              <w:t xml:space="preserve"> de hijos, cuestionarios diarios, foros, FAQ y recursos audiovisuales. Desde la perspectiva de cierre </w:t>
-            </w:r>
-            <w:r>
-              <w:rPr>
-                <w:rFonts w:ascii="Times New Roman" w:hAnsi="Times New Roman"/>
-                <w:sz w:val="24"/>
-                <w:szCs w:val="24"/>
-                <w:lang w:val="es-ES"/>
-              </w:rPr>
-              <w:t>académico</w:t>
-            </w:r>
-            <w:r>
-              <w:rPr>
-                <w:rFonts w:ascii="Times New Roman" w:hAnsi="Times New Roman"/>
-                <w:sz w:val="24"/>
-                <w:szCs w:val="24"/>
-                <w:lang w:val="es-ES"/>
-              </w:rPr>
-              <w:t xml:space="preserve"> del TFM, el </w:t>
+              <w:t xml:space="preserve"> incluye autenticación de usuarios, gestión de hijos, cuestionarios diarios, foros, FAQ</w:t>
+            </w:r>
+            <w:r>
+              <w:rPr>
+                <w:rFonts w:ascii="Times New Roman" w:hAnsi="Times New Roman"/>
+                <w:sz w:val="24"/>
+                <w:szCs w:val="24"/>
+                <w:lang w:val="es-ES"/>
+              </w:rPr>
+              <w:t>,</w:t>
+            </w:r>
+            <w:r>
+              <w:rPr>
+                <w:rFonts w:ascii="Times New Roman" w:hAnsi="Times New Roman"/>
+                <w:sz w:val="24"/>
+                <w:szCs w:val="24"/>
+                <w:lang w:val="es-ES"/>
+              </w:rPr>
+              <w:t xml:space="preserve"> recursos audiovisuales</w:t>
+            </w:r>
+            <w:r>
+              <w:rPr>
+                <w:rFonts w:ascii="Times New Roman" w:hAnsi="Times New Roman"/>
+                <w:sz w:val="24"/>
+                <w:szCs w:val="24"/>
+                <w:lang w:val="es-ES"/>
+              </w:rPr>
+              <w:t>, notificaciones y premios</w:t>
+            </w:r>
+            <w:r>
+              <w:rPr>
+                <w:rFonts w:ascii="Times New Roman" w:hAnsi="Times New Roman"/>
+                <w:sz w:val="24"/>
+                <w:szCs w:val="24"/>
+                <w:lang w:val="es-ES"/>
+              </w:rPr>
+              <w:t xml:space="preserve">. Desde la perspectiva de cierre académico del TFM, el </w:t>
             </w:r>
             <w:r>
               <w:rPr>
@@ -1653,25 +1507,7 @@
                 <w:szCs w:val="24"/>
                 <w:lang w:val="es-ES"/>
               </w:rPr>
-              <w:t xml:space="preserve"> una fase de mejora y </w:t>
-            </w:r>
-            <w:r>
-              <w:rPr>
-                <w:rFonts w:ascii="Times New Roman" w:hAnsi="Times New Roman"/>
-                <w:sz w:val="24"/>
-                <w:szCs w:val="24"/>
-                <w:lang w:val="es-ES"/>
-              </w:rPr>
-              <w:t>consolidación</w:t>
-            </w:r>
-            <w:r>
-              <w:rPr>
-                <w:rFonts w:ascii="Times New Roman" w:hAnsi="Times New Roman"/>
-                <w:sz w:val="24"/>
-                <w:szCs w:val="24"/>
-                <w:lang w:val="es-ES"/>
-              </w:rPr>
-              <w:t xml:space="preserve"> centrada en </w:t>
+              <w:t xml:space="preserve"> una fase de mejora y consolidación centrada en </w:t>
             </w:r>
             <w:r>
               <w:rPr>
@@ -1698,32 +1534,59 @@
                 <w:szCs w:val="24"/>
                 <w:lang w:val="es-ES"/>
               </w:rPr>
-              <w:t xml:space="preserve">(i) finalización de flujos pendientes de </w:t>
-            </w:r>
-            <w:r>
-              <w:rPr>
-                <w:rFonts w:ascii="Times New Roman" w:hAnsi="Times New Roman"/>
-                <w:sz w:val="24"/>
-                <w:szCs w:val="24"/>
-                <w:lang w:val="pt-ES"/>
-              </w:rPr>
-              <w:t>premios, notificaciones, recursos audiovisuales y FAQ</w:t>
-            </w:r>
-            <w:r>
-              <w:rPr>
-                <w:rFonts w:ascii="Times New Roman" w:hAnsi="Times New Roman"/>
-                <w:sz w:val="24"/>
-                <w:szCs w:val="24"/>
-                <w:lang w:val="pt-ES"/>
-              </w:rPr>
-              <w:t>,</w:t>
-            </w:r>
-            <w:r>
-              <w:rPr>
-                <w:rFonts w:ascii="Times New Roman" w:hAnsi="Times New Roman"/>
-                <w:sz w:val="24"/>
-                <w:szCs w:val="24"/>
-                <w:lang w:val="es-ES"/>
+              <w:t xml:space="preserve">(i) </w:t>
+            </w:r>
+            <w:r>
+              <w:rPr>
+                <w:rFonts w:ascii="Times New Roman" w:hAnsi="Times New Roman"/>
+                <w:sz w:val="24"/>
+                <w:szCs w:val="24"/>
+                <w:lang w:val="es-ES"/>
+              </w:rPr>
+              <w:t>finalizar</w:t>
+            </w:r>
+            <w:r>
+              <w:rPr>
+                <w:rFonts w:ascii="Times New Roman" w:hAnsi="Times New Roman"/>
+                <w:sz w:val="24"/>
+                <w:szCs w:val="24"/>
+                <w:lang w:val="es-ES"/>
+              </w:rPr>
+              <w:t xml:space="preserve"> de flujos pendientes de </w:t>
+            </w:r>
+            <w:r>
+              <w:rPr>
+                <w:rFonts w:ascii="Times New Roman" w:hAnsi="Times New Roman"/>
+                <w:sz w:val="24"/>
+                <w:szCs w:val="24"/>
+                <w:lang w:val="pt-ES"/>
+              </w:rPr>
+              <w:t>premios</w:t>
+            </w:r>
+            <w:r>
+              <w:rPr>
+                <w:rFonts w:ascii="Times New Roman" w:hAnsi="Times New Roman"/>
+                <w:sz w:val="24"/>
+                <w:szCs w:val="24"/>
+                <w:lang w:val="pt-ES"/>
+              </w:rPr>
+              <w:t xml:space="preserve"> y </w:t>
+            </w:r>
+            <w:r>
+              <w:rPr>
+                <w:rFonts w:ascii="Times New Roman" w:hAnsi="Times New Roman"/>
+                <w:sz w:val="24"/>
+                <w:szCs w:val="24"/>
+                <w:lang w:val="pt-ES"/>
+              </w:rPr>
+              <w:t>notificaciones</w:t>
+            </w:r>
+            <w:r>
+              <w:rPr>
+                <w:rFonts w:ascii="Times New Roman" w:hAnsi="Times New Roman"/>
+                <w:sz w:val="24"/>
+                <w:szCs w:val="24"/>
+                <w:lang w:val="pt-ES"/>
               </w:rPr>
               <w:t xml:space="preserve"> </w:t>
             </w:r>
@@ -1783,6 +1646,35 @@
                 <w:szCs w:val="24"/>
                 <w:lang w:val="es-ES"/>
               </w:rPr>
+              <w:t xml:space="preserve"> arquitectónico de </w:t>
+            </w:r>
+            <w:r>
+              <w:rPr>
+                <w:rFonts w:ascii="Times New Roman" w:hAnsi="Times New Roman"/>
+                <w:sz w:val="24"/>
+                <w:szCs w:val="24"/>
+                <w:lang w:val="es-ES"/>
+              </w:rPr>
+              <w:t xml:space="preserve">la </w:t>
+            </w:r>
+            <w:proofErr w:type="gramStart"/>
+            <w:r>
+              <w:rPr>
+                <w:rFonts w:ascii="Times New Roman" w:hAnsi="Times New Roman"/>
+                <w:sz w:val="24"/>
+                <w:szCs w:val="24"/>
+                <w:lang w:val="es-ES"/>
+              </w:rPr>
+              <w:t>app</w:t>
+            </w:r>
+            <w:proofErr w:type="gramEnd"/>
+            <w:r>
+              <w:rPr>
+                <w:rFonts w:ascii="Times New Roman" w:hAnsi="Times New Roman"/>
+                <w:sz w:val="24"/>
+                <w:szCs w:val="24"/>
+                <w:lang w:val="es-ES"/>
+              </w:rPr>
               <w:t xml:space="preserve"> </w:t>
             </w:r>
             <w:r>
@@ -1792,90 +1684,7 @@
                 <w:szCs w:val="24"/>
                 <w:lang w:val="es-ES"/>
               </w:rPr>
-              <w:t>arquitectónico</w:t>
-            </w:r>
-            <w:r>
-              <w:rPr>
-                <w:rFonts w:ascii="Times New Roman" w:hAnsi="Times New Roman"/>
-                <w:sz w:val="24"/>
-                <w:szCs w:val="24"/>
-                <w:lang w:val="es-ES"/>
-              </w:rPr>
-              <w:t xml:space="preserve"> de </w:t>
-            </w:r>
-            <w:r>
-              <w:rPr>
-                <w:rFonts w:ascii="Times New Roman" w:hAnsi="Times New Roman"/>
-                <w:sz w:val="24"/>
-                <w:szCs w:val="24"/>
-                <w:lang w:val="es-ES"/>
-              </w:rPr>
-              <w:t xml:space="preserve">la </w:t>
-            </w:r>
-            <w:proofErr w:type="gramStart"/>
-            <w:r>
-              <w:rPr>
-                <w:rFonts w:ascii="Times New Roman" w:hAnsi="Times New Roman"/>
-                <w:sz w:val="24"/>
-                <w:szCs w:val="24"/>
-                <w:lang w:val="es-ES"/>
-              </w:rPr>
-              <w:t>app</w:t>
-            </w:r>
-            <w:proofErr w:type="gramEnd"/>
-            <w:r>
-              <w:rPr>
-                <w:rFonts w:ascii="Times New Roman" w:hAnsi="Times New Roman"/>
-                <w:sz w:val="24"/>
-                <w:szCs w:val="24"/>
-                <w:lang w:val="es-ES"/>
-              </w:rPr>
-              <w:t xml:space="preserve"> </w:t>
-            </w:r>
-            <w:r>
-              <w:rPr>
-                <w:rFonts w:ascii="Times New Roman" w:hAnsi="Times New Roman"/>
-                <w:sz w:val="24"/>
-                <w:szCs w:val="24"/>
-                <w:lang w:val="es-ES"/>
-              </w:rPr>
-              <w:t xml:space="preserve">Android </w:t>
-            </w:r>
-            <w:r>
-              <w:rPr>
-                <w:rFonts w:ascii="Times New Roman" w:hAnsi="Times New Roman"/>
-                <w:sz w:val="24"/>
-                <w:szCs w:val="24"/>
-                <w:lang w:val="es-ES"/>
-              </w:rPr>
-              <w:t>según</w:t>
-            </w:r>
-            <w:r>
-              <w:rPr>
-                <w:rFonts w:ascii="Times New Roman" w:hAnsi="Times New Roman"/>
-                <w:sz w:val="24"/>
-                <w:szCs w:val="24"/>
-                <w:lang w:val="es-ES"/>
-              </w:rPr>
-              <w:t xml:space="preserve"> buenas </w:t>
-            </w:r>
-            <w:r>
-              <w:rPr>
-                <w:rFonts w:ascii="Times New Roman" w:hAnsi="Times New Roman"/>
-                <w:sz w:val="24"/>
-                <w:szCs w:val="24"/>
-                <w:lang w:val="es-ES"/>
-              </w:rPr>
-              <w:t>prácticas</w:t>
-            </w:r>
-            <w:r>
-              <w:rPr>
-                <w:rFonts w:ascii="Times New Roman" w:hAnsi="Times New Roman"/>
-                <w:sz w:val="24"/>
-                <w:szCs w:val="24"/>
-                <w:lang w:val="es-ES"/>
-              </w:rPr>
-              <w:t>, (</w:t>
+              <w:t>Android según buenas prácticas, (</w:t>
             </w:r>
             <w:proofErr w:type="spellStart"/>
             <w:r>
@@ -1904,7 +1713,25 @@
                 <w:szCs w:val="24"/>
                 <w:lang w:val="es-ES"/>
               </w:rPr>
-              <w:t>) incremento de calidad mediante pruebas automatizadas, y (</w:t>
+              <w:t>) incremento de calidad mediante pruebas automatizadas</w:t>
+            </w:r>
+            <w:r>
+              <w:rPr>
+                <w:rFonts w:ascii="Times New Roman" w:hAnsi="Times New Roman"/>
+                <w:sz w:val="24"/>
+                <w:szCs w:val="24"/>
+                <w:lang w:val="es-ES"/>
+              </w:rPr>
+              <w:t xml:space="preserve"> en la API</w:t>
+            </w:r>
+            <w:r>
+              <w:rPr>
+                <w:rFonts w:ascii="Times New Roman" w:hAnsi="Times New Roman"/>
+                <w:sz w:val="24"/>
+                <w:szCs w:val="24"/>
+                <w:lang w:val="es-ES"/>
+              </w:rPr>
+              <w:t>, y (</w:t>
             </w:r>
             <w:proofErr w:type="spellStart"/>
             <w:r>
@@ -1924,7 +1751,25 @@
                 <w:szCs w:val="24"/>
                 <w:lang w:val="es-ES"/>
               </w:rPr>
-              <w:t>) despliegue en nube como evidencia de aplicabilidad real.</w:t>
+              <w:t xml:space="preserve">) despliegue </w:t>
+            </w:r>
+            <w:r>
+              <w:rPr>
+                <w:rFonts w:ascii="Times New Roman" w:hAnsi="Times New Roman"/>
+                <w:sz w:val="24"/>
+                <w:szCs w:val="24"/>
+                <w:lang w:val="es-ES"/>
+              </w:rPr>
+              <w:t xml:space="preserve">de la API </w:t>
+            </w:r>
+            <w:r>
+              <w:rPr>
+                <w:rFonts w:ascii="Times New Roman" w:hAnsi="Times New Roman"/>
+                <w:sz w:val="24"/>
+                <w:szCs w:val="24"/>
+                <w:lang w:val="es-ES"/>
+              </w:rPr>
+              <w:t>en nube como evidencia de aplicabilidad real.</w:t>
             </w:r>
           </w:p>
           <w:p>
@@ -1963,97 +1808,7 @@
                 <w:szCs w:val="24"/>
                 <w:lang w:val="es-ES"/>
               </w:rPr>
-              <w:t>Metodológicamente</w:t>
-            </w:r>
-            <w:r>
-              <w:rPr>
-                <w:rFonts w:ascii="Times New Roman" w:hAnsi="Times New Roman"/>
-                <w:sz w:val="24"/>
-                <w:szCs w:val="24"/>
-                <w:lang w:val="es-ES"/>
-              </w:rPr>
-              <w:t xml:space="preserve">, el trabajo se organiza con un enfoque </w:t>
-            </w:r>
-            <w:r>
-              <w:rPr>
-                <w:rFonts w:ascii="Times New Roman" w:hAnsi="Times New Roman"/>
-                <w:sz w:val="24"/>
-                <w:szCs w:val="24"/>
-                <w:lang w:val="es-ES"/>
-              </w:rPr>
-              <w:t>ágil</w:t>
-            </w:r>
-            <w:r>
-              <w:rPr>
-                <w:rFonts w:ascii="Times New Roman" w:hAnsi="Times New Roman"/>
-                <w:sz w:val="24"/>
-                <w:szCs w:val="24"/>
-                <w:lang w:val="es-ES"/>
-              </w:rPr>
-              <w:t xml:space="preserve"> hibrido (Scrum semanal + flujo Kanban), apoyado en historias de usuario, criterios de </w:t>
-            </w:r>
-            <w:r>
-              <w:rPr>
-                <w:rFonts w:ascii="Times New Roman" w:hAnsi="Times New Roman"/>
-                <w:sz w:val="24"/>
-                <w:szCs w:val="24"/>
-                <w:lang w:val="es-ES"/>
-              </w:rPr>
-              <w:t>aceptación</w:t>
-            </w:r>
-            <w:r>
-              <w:rPr>
-                <w:rFonts w:ascii="Times New Roman" w:hAnsi="Times New Roman"/>
-                <w:sz w:val="24"/>
-                <w:szCs w:val="24"/>
-                <w:lang w:val="es-ES"/>
-              </w:rPr>
-              <w:t xml:space="preserve"> y evidencias por </w:t>
-            </w:r>
-            <w:r>
-              <w:rPr>
-                <w:rFonts w:ascii="Times New Roman" w:hAnsi="Times New Roman"/>
-                <w:sz w:val="24"/>
-                <w:szCs w:val="24"/>
-                <w:lang w:val="es-ES"/>
-              </w:rPr>
-              <w:t>iteración</w:t>
-            </w:r>
-            <w:r>
-              <w:rPr>
-                <w:rFonts w:ascii="Times New Roman" w:hAnsi="Times New Roman"/>
-                <w:sz w:val="24"/>
-                <w:szCs w:val="24"/>
-                <w:lang w:val="es-ES"/>
-              </w:rPr>
-              <w:t xml:space="preserve">. Este planteamiento permite equilibrar desarrollo </w:t>
-            </w:r>
-            <w:r>
-              <w:rPr>
-                <w:rFonts w:ascii="Times New Roman" w:hAnsi="Times New Roman"/>
-                <w:sz w:val="24"/>
-                <w:szCs w:val="24"/>
-                <w:lang w:val="es-ES"/>
-              </w:rPr>
-              <w:t>técnico</w:t>
-            </w:r>
-            <w:r>
-              <w:rPr>
-                <w:rFonts w:ascii="Times New Roman" w:hAnsi="Times New Roman"/>
-                <w:sz w:val="24"/>
-                <w:szCs w:val="24"/>
-                <w:lang w:val="es-ES"/>
-              </w:rPr>
-              <w:t xml:space="preserve"> y entregables </w:t>
-            </w:r>
-            <w:r>
-              <w:rPr>
-                <w:rFonts w:ascii="Times New Roman" w:hAnsi="Times New Roman"/>
-                <w:sz w:val="24"/>
-                <w:szCs w:val="24"/>
-                <w:lang w:val="es-ES"/>
-              </w:rPr>
-              <w:t>académico</w:t>
+              <w:t>Metodológicamente, el trabajo se organiza con un enfoque ágil hibrido (Scrum semanal + flujo Kanban), apoyado en historias de usuario, criterios de aceptación y evidencias por iteración. Este planteamiento permite equilibrar desarrollo técnico y entregables académico</w:t>
             </w:r>
             <w:r>
               <w:rPr>
@@ -2113,7 +1868,6 @@
                 <w:b/>
                 <w:lang w:val="es-ES"/>
               </w:rPr>
-              <w:lastRenderedPageBreak/>
               <w:t>Abstract</w:t>
             </w:r>
           </w:p>
@@ -2312,16 +2066,97 @@
                 <w:szCs w:val="24"/>
                 <w:lang w:val="pt-ES"/>
               </w:rPr>
-              <w:t xml:space="preserve">finishing the flows of awards, notifications, audiovisual resources and </w:t>
-            </w:r>
-            <w:r>
-              <w:rPr>
-                <w:rFonts w:ascii="Times New Roman" w:hAnsi="Times New Roman"/>
-                <w:sz w:val="24"/>
-                <w:szCs w:val="24"/>
-                <w:lang w:val="pt-ES"/>
-              </w:rPr>
-              <w:t xml:space="preserve">FAQ; </w:t>
+              <w:t>completing</w:t>
+            </w:r>
+            <w:r>
+              <w:rPr>
+                <w:rFonts w:ascii="Times New Roman" w:hAnsi="Times New Roman"/>
+                <w:sz w:val="24"/>
+                <w:szCs w:val="24"/>
+                <w:lang w:val="pt-ES"/>
+              </w:rPr>
+              <w:t xml:space="preserve"> </w:t>
+            </w:r>
+            <w:r>
+              <w:rPr>
+                <w:rFonts w:ascii="Times New Roman" w:hAnsi="Times New Roman"/>
+                <w:sz w:val="24"/>
+                <w:szCs w:val="24"/>
+                <w:lang w:val="pt-ES"/>
+              </w:rPr>
+              <w:t xml:space="preserve">the </w:t>
+            </w:r>
+            <w:r>
+              <w:rPr>
+                <w:rFonts w:ascii="Times New Roman" w:hAnsi="Times New Roman"/>
+                <w:sz w:val="24"/>
+                <w:szCs w:val="24"/>
+                <w:lang w:val="pt-ES"/>
+              </w:rPr>
+              <w:t>award</w:t>
+            </w:r>
+            <w:r>
+              <w:rPr>
+                <w:rFonts w:ascii="Times New Roman" w:hAnsi="Times New Roman"/>
+                <w:sz w:val="24"/>
+                <w:szCs w:val="24"/>
+                <w:lang w:val="pt-ES"/>
+              </w:rPr>
+              <w:t xml:space="preserve"> and </w:t>
+            </w:r>
+            <w:r>
+              <w:rPr>
+                <w:rFonts w:ascii="Times New Roman" w:hAnsi="Times New Roman"/>
+                <w:sz w:val="24"/>
+                <w:szCs w:val="24"/>
+                <w:lang w:val="pt-ES"/>
+              </w:rPr>
+              <w:t>notification</w:t>
+            </w:r>
+            <w:r>
+              <w:rPr>
+                <w:rFonts w:ascii="Times New Roman" w:hAnsi="Times New Roman"/>
+                <w:sz w:val="24"/>
+                <w:szCs w:val="24"/>
+                <w:lang w:val="pt-ES"/>
+              </w:rPr>
+              <w:t xml:space="preserve"> </w:t>
+            </w:r>
+            <w:r>
+              <w:rPr>
+                <w:rFonts w:ascii="Times New Roman" w:hAnsi="Times New Roman"/>
+                <w:sz w:val="24"/>
+                <w:szCs w:val="24"/>
+                <w:lang w:val="pt-ES"/>
+              </w:rPr>
+              <w:t>work</w:t>
+            </w:r>
+            <w:r>
+              <w:rPr>
+                <w:rFonts w:ascii="Times New Roman" w:hAnsi="Times New Roman"/>
+                <w:sz w:val="24"/>
+                <w:szCs w:val="24"/>
+                <w:lang w:val="pt-ES"/>
+              </w:rPr>
+              <w:t>flows</w:t>
+            </w:r>
+            <w:r>
+              <w:rPr>
+                <w:rFonts w:ascii="Times New Roman" w:hAnsi="Times New Roman"/>
+                <w:sz w:val="24"/>
+                <w:szCs w:val="24"/>
+                <w:lang w:val="pt-ES"/>
+              </w:rPr>
+              <w:t>;</w:t>
+            </w:r>
+            <w:r>
+              <w:rPr>
+                <w:rFonts w:ascii="Times New Roman" w:hAnsi="Times New Roman"/>
+                <w:sz w:val="24"/>
+                <w:szCs w:val="24"/>
+                <w:lang w:val="pt-ES"/>
+              </w:rPr>
+              <w:t xml:space="preserve"> </w:t>
             </w:r>
             <w:r>
               <w:rPr>
@@ -2349,6 +2184,15 @@
                 <w:lang w:val="pt-ES"/>
               </w:rPr>
               <w:t>quality improvement through automated testing</w:t>
+            </w:r>
+            <w:r>
+              <w:rPr>
+                <w:rFonts w:ascii="Times New Roman" w:hAnsi="Times New Roman"/>
+                <w:sz w:val="24"/>
+                <w:szCs w:val="24"/>
+                <w:lang w:val="pt-ES"/>
+              </w:rPr>
+              <w:t xml:space="preserve"> in the API</w:t>
             </w:r>
             <w:r>
               <w:rPr>
@@ -2469,7 +2313,7 @@
                 <w:szCs w:val="24"/>
                 <w:lang w:val="es-ES"/>
               </w:rPr>
-              <w:t>ngeniería</w:t>
+              <w:t xml:space="preserve">ngeniería Web, Android, API REST, </w:t>
             </w:r>
             <w:r>
               <w:rPr>
@@ -2477,19 +2321,8 @@
                 <w:b/>
                 <w:sz w:val="24"/>
                 <w:szCs w:val="24"/>
-                <w:lang w:val="es-ES"/>
-              </w:rPr>
-              <w:t xml:space="preserve"> Web, Android, API REST, </w:t>
-            </w:r>
-            <w:r>
-              <w:rPr>
-                <w:rFonts w:ascii="Times New Roman" w:hAnsi="Times New Roman"/>
-                <w:b/>
-                <w:sz w:val="24"/>
-                <w:szCs w:val="24"/>
-                <w:lang w:val="es-ES"/>
-              </w:rPr>
-              <w:t>refactorización</w:t>
+              </w:rPr>
+              <w:t>refactoring</w:t>
             </w:r>
             <w:r>
               <w:rPr>
@@ -2557,16 +2390,7 @@
                 <w:sz w:val="24"/>
                 <w:szCs w:val="24"/>
               </w:rPr>
-              <w:t xml:space="preserve">: </w:t>
-            </w:r>
-            <w:r>
-              <w:rPr>
-                <w:rFonts w:ascii="Times New Roman" w:hAnsi="Times New Roman"/>
-                <w:b/>
-                <w:sz w:val="24"/>
-                <w:szCs w:val="24"/>
-              </w:rPr>
-              <w:t>Web Engineering, Android, REST API, refactoring, software quality, cloud deployment</w:t>
+              <w:t>: Web Engineering, Android, REST API, refactoring, software quality, cloud deployment</w:t>
             </w:r>
           </w:p>
         </w:tc>

</xml_diff>

<commit_message>
docs(anteproyecto): complete project proposal
</commit_message>
<xml_diff>
--- a/docs/MiW.TFM.Anteproyecto.AnexoI.docx
+++ b/docs/MiW.TFM.Anteproyecto.AnexoI.docx
@@ -14,8 +14,6 @@
           <w:rFonts w:ascii="Times New Roman" w:hAnsi="Times New Roman"/>
           <w:b/>
           <w:bCs/>
-          <w:sz w:val="24"/>
-          <w:szCs w:val="24"/>
           <w:lang w:val="es-ES"/>
         </w:rPr>
       </w:pPr>
@@ -28,8 +26,6 @@
           <w:rFonts w:ascii="Times New Roman" w:hAnsi="Times New Roman"/>
           <w:b/>
           <w:bCs/>
-          <w:sz w:val="24"/>
-          <w:szCs w:val="24"/>
           <w:lang w:val="es-ES"/>
         </w:rPr>
         <w:t>A</w:t>
@@ -39,8 +35,6 @@
           <w:rFonts w:ascii="Times New Roman" w:hAnsi="Times New Roman"/>
           <w:b/>
           <w:bCs/>
-          <w:sz w:val="24"/>
-          <w:szCs w:val="24"/>
           <w:lang w:val="es-ES"/>
         </w:rPr>
         <w:t>NEXO I</w:t>
@@ -50,8 +44,6 @@
           <w:rFonts w:ascii="Times New Roman" w:hAnsi="Times New Roman"/>
           <w:b/>
           <w:bCs/>
-          <w:sz w:val="24"/>
-          <w:szCs w:val="24"/>
           <w:lang w:val="es-ES"/>
         </w:rPr>
         <w:t xml:space="preserve">: </w:t>
@@ -61,8 +53,6 @@
           <w:rFonts w:ascii="Times New Roman" w:hAnsi="Times New Roman"/>
           <w:b/>
           <w:bCs/>
-          <w:sz w:val="24"/>
-          <w:szCs w:val="24"/>
           <w:lang w:val="es-ES"/>
         </w:rPr>
         <w:t>Anteproyecto</w:t>
@@ -75,11 +65,9 @@
         <w:autoSpaceDN w:val="0"/>
         <w:adjustRightInd w:val="0"/>
         <w:spacing w:after="0" w:line="240" w:lineRule="auto"/>
-        <w:jc w:val="center"/>
+        <w:jc w:val="both"/>
         <w:rPr>
           <w:rFonts w:ascii="Times New Roman" w:hAnsi="Times New Roman"/>
-          <w:sz w:val="24"/>
-          <w:szCs w:val="24"/>
           <w:lang w:val="es-ES"/>
         </w:rPr>
       </w:pPr>
@@ -91,8 +79,8 @@
         <w:tblLook w:val="04A0" w:firstRow="1" w:lastRow="0" w:firstColumn="1" w:lastColumn="0" w:noHBand="0" w:noVBand="1"/>
       </w:tblPr>
       <w:tblGrid>
-        <w:gridCol w:w="2235"/>
-        <w:gridCol w:w="3572"/>
+        <w:gridCol w:w="2122"/>
+        <w:gridCol w:w="3685"/>
         <w:gridCol w:w="3940"/>
       </w:tblGrid>
       <w:tr>
@@ -101,12 +89,13 @@
         </w:trPr>
         <w:tc>
           <w:tcPr>
-            <w:tcW w:w="2235" w:type="dxa"/>
+            <w:tcW w:w="2122" w:type="dxa"/>
             <w:vAlign w:val="center"/>
           </w:tcPr>
           <w:p>
             <w:pPr>
               <w:pStyle w:val="Texto"/>
+              <w:jc w:val="both"/>
               <w:rPr>
                 <w:lang w:val="es-ES"/>
               </w:rPr>
@@ -121,17 +110,16 @@
         </w:tc>
         <w:tc>
           <w:tcPr>
-            <w:tcW w:w="7512" w:type="dxa"/>
+            <w:tcW w:w="7625" w:type="dxa"/>
             <w:gridSpan w:val="2"/>
             <w:vAlign w:val="center"/>
           </w:tcPr>
           <w:p>
             <w:pPr>
               <w:pStyle w:val="Texto"/>
+              <w:jc w:val="both"/>
               <w:rPr>
                 <w:b/>
-                <w:sz w:val="24"/>
-                <w:szCs w:val="24"/>
                 <w:lang w:val="es-ES"/>
               </w:rPr>
             </w:pPr>
@@ -151,12 +139,13 @@
         </w:trPr>
         <w:tc>
           <w:tcPr>
-            <w:tcW w:w="2235" w:type="dxa"/>
+            <w:tcW w:w="2122" w:type="dxa"/>
             <w:vAlign w:val="center"/>
           </w:tcPr>
           <w:p>
             <w:pPr>
               <w:pStyle w:val="Texto"/>
+              <w:jc w:val="both"/>
               <w:rPr>
                 <w:b/>
                 <w:lang w:val="es-ES"/>
@@ -201,7 +190,7 @@
         </w:tc>
         <w:tc>
           <w:tcPr>
-            <w:tcW w:w="7512" w:type="dxa"/>
+            <w:tcW w:w="7625" w:type="dxa"/>
             <w:gridSpan w:val="2"/>
             <w:vAlign w:val="center"/>
           </w:tcPr>
@@ -211,33 +200,16 @@
               <w:autoSpaceDE w:val="0"/>
               <w:autoSpaceDN w:val="0"/>
               <w:adjustRightInd w:val="0"/>
-              <w:spacing w:after="0" w:line="200" w:lineRule="exact"/>
-              <w:rPr>
-                <w:rFonts w:ascii="Times New Roman" w:hAnsi="Times New Roman"/>
-                <w:sz w:val="24"/>
-                <w:szCs w:val="24"/>
-              </w:rPr>
-            </w:pPr>
-          </w:p>
-          <w:p>
-            <w:pPr>
-              <w:widowControl w:val="0"/>
-              <w:autoSpaceDE w:val="0"/>
-              <w:autoSpaceDN w:val="0"/>
-              <w:adjustRightInd w:val="0"/>
-              <w:spacing w:after="0" w:line="200" w:lineRule="exact"/>
-              <w:rPr>
-                <w:rFonts w:ascii="Times New Roman" w:hAnsi="Times New Roman"/>
-                <w:sz w:val="24"/>
-                <w:szCs w:val="24"/>
+              <w:spacing w:after="0" w:line="240" w:lineRule="auto"/>
+              <w:jc w:val="both"/>
+              <w:rPr>
+                <w:rFonts w:ascii="Times New Roman" w:hAnsi="Times New Roman"/>
               </w:rPr>
             </w:pPr>
             <w:proofErr w:type="spellStart"/>
             <w:r>
               <w:rPr>
                 <w:rFonts w:ascii="Times New Roman" w:hAnsi="Times New Roman"/>
-                <w:sz w:val="24"/>
-                <w:szCs w:val="24"/>
               </w:rPr>
               <w:t>CRIApp</w:t>
             </w:r>
@@ -245,8 +217,6 @@
             <w:r>
               <w:rPr>
                 <w:rFonts w:ascii="Times New Roman" w:hAnsi="Times New Roman"/>
-                <w:sz w:val="24"/>
-                <w:szCs w:val="24"/>
               </w:rPr>
               <w:t xml:space="preserve">: Plataforma web y </w:t>
             </w:r>
@@ -254,24 +224,18 @@
             <w:r>
               <w:rPr>
                 <w:rFonts w:ascii="Times New Roman" w:hAnsi="Times New Roman"/>
-                <w:sz w:val="24"/>
-                <w:szCs w:val="24"/>
               </w:rPr>
               <w:t>m</w:t>
             </w:r>
             <w:r>
               <w:rPr>
                 <w:rFonts w:ascii="Times New Roman" w:hAnsi="Times New Roman"/>
-                <w:sz w:val="24"/>
-                <w:szCs w:val="24"/>
               </w:rPr>
               <w:t>ó</w:t>
             </w:r>
             <w:r>
               <w:rPr>
                 <w:rFonts w:ascii="Times New Roman" w:hAnsi="Times New Roman"/>
-                <w:sz w:val="24"/>
-                <w:szCs w:val="24"/>
               </w:rPr>
               <w:t>vil</w:t>
             </w:r>
@@ -279,8 +243,6 @@
             <w:r>
               <w:rPr>
                 <w:rFonts w:ascii="Times New Roman" w:hAnsi="Times New Roman"/>
-                <w:sz w:val="24"/>
-                <w:szCs w:val="24"/>
               </w:rPr>
               <w:t xml:space="preserve"> para </w:t>
             </w:r>
@@ -288,8 +250,6 @@
             <w:r>
               <w:rPr>
                 <w:rFonts w:ascii="Times New Roman" w:hAnsi="Times New Roman"/>
-                <w:sz w:val="24"/>
-                <w:szCs w:val="24"/>
               </w:rPr>
               <w:t>apoyo</w:t>
             </w:r>
@@ -297,8 +257,6 @@
             <w:r>
               <w:rPr>
                 <w:rFonts w:ascii="Times New Roman" w:hAnsi="Times New Roman"/>
-                <w:sz w:val="24"/>
-                <w:szCs w:val="24"/>
               </w:rPr>
               <w:t xml:space="preserve"> a la </w:t>
             </w:r>
@@ -306,8 +264,6 @@
             <w:r>
               <w:rPr>
                 <w:rFonts w:ascii="Times New Roman" w:hAnsi="Times New Roman"/>
-                <w:sz w:val="24"/>
-                <w:szCs w:val="24"/>
               </w:rPr>
               <w:t>crianza</w:t>
             </w:r>
@@ -315,8 +271,6 @@
             <w:r>
               <w:rPr>
                 <w:rFonts w:ascii="Times New Roman" w:hAnsi="Times New Roman"/>
-                <w:sz w:val="24"/>
-                <w:szCs w:val="24"/>
               </w:rPr>
               <w:t xml:space="preserve"> </w:t>
             </w:r>
@@ -324,8 +278,6 @@
             <w:r>
               <w:rPr>
                 <w:rFonts w:ascii="Times New Roman" w:hAnsi="Times New Roman"/>
-                <w:sz w:val="24"/>
-                <w:szCs w:val="24"/>
               </w:rPr>
               <w:t>mediante</w:t>
             </w:r>
@@ -333,8 +285,6 @@
             <w:r>
               <w:rPr>
                 <w:rFonts w:ascii="Times New Roman" w:hAnsi="Times New Roman"/>
-                <w:sz w:val="24"/>
-                <w:szCs w:val="24"/>
               </w:rPr>
               <w:t xml:space="preserve"> </w:t>
             </w:r>
@@ -342,8 +292,6 @@
             <w:r>
               <w:rPr>
                 <w:rFonts w:ascii="Times New Roman" w:hAnsi="Times New Roman"/>
-                <w:sz w:val="24"/>
-                <w:szCs w:val="24"/>
               </w:rPr>
               <w:t>cuestionarios</w:t>
             </w:r>
@@ -351,8 +299,6 @@
             <w:r>
               <w:rPr>
                 <w:rFonts w:ascii="Times New Roman" w:hAnsi="Times New Roman"/>
-                <w:sz w:val="24"/>
-                <w:szCs w:val="24"/>
               </w:rPr>
               <w:t xml:space="preserve"> y </w:t>
             </w:r>
@@ -360,58 +306,38 @@
             <w:r>
               <w:rPr>
                 <w:rFonts w:ascii="Times New Roman" w:hAnsi="Times New Roman"/>
-                <w:sz w:val="24"/>
-                <w:szCs w:val="24"/>
               </w:rPr>
               <w:t>gamificaci</w:t>
             </w:r>
             <w:r>
               <w:rPr>
                 <w:rFonts w:ascii="Times New Roman" w:hAnsi="Times New Roman"/>
-                <w:sz w:val="24"/>
-                <w:szCs w:val="24"/>
               </w:rPr>
               <w:t>ó</w:t>
             </w:r>
             <w:r>
               <w:rPr>
                 <w:rFonts w:ascii="Times New Roman" w:hAnsi="Times New Roman"/>
-                <w:sz w:val="24"/>
-                <w:szCs w:val="24"/>
               </w:rPr>
               <w:t>n</w:t>
             </w:r>
             <w:proofErr w:type="spellEnd"/>
-          </w:p>
-          <w:p>
-            <w:pPr>
-              <w:widowControl w:val="0"/>
-              <w:autoSpaceDE w:val="0"/>
-              <w:autoSpaceDN w:val="0"/>
-              <w:adjustRightInd w:val="0"/>
-              <w:spacing w:after="0" w:line="200" w:lineRule="exact"/>
-              <w:rPr>
-                <w:rFonts w:ascii="Times New Roman" w:hAnsi="Times New Roman"/>
-                <w:sz w:val="24"/>
-                <w:szCs w:val="24"/>
-                <w:lang w:val="es-ES"/>
-              </w:rPr>
-            </w:pPr>
           </w:p>
         </w:tc>
       </w:tr>
       <w:tr>
         <w:trPr>
-          <w:trHeight w:val="432"/>
+          <w:trHeight w:val="383"/>
         </w:trPr>
         <w:tc>
           <w:tcPr>
-            <w:tcW w:w="2235" w:type="dxa"/>
+            <w:tcW w:w="2122" w:type="dxa"/>
             <w:vAlign w:val="center"/>
           </w:tcPr>
           <w:p>
             <w:pPr>
               <w:pStyle w:val="Texto"/>
+              <w:jc w:val="both"/>
               <w:rPr>
                 <w:b/>
                 <w:lang w:val="es-ES"/>
@@ -428,7 +354,7 @@
         </w:tc>
         <w:tc>
           <w:tcPr>
-            <w:tcW w:w="7512" w:type="dxa"/>
+            <w:tcW w:w="7625" w:type="dxa"/>
             <w:gridSpan w:val="2"/>
             <w:vAlign w:val="center"/>
           </w:tcPr>
@@ -438,92 +364,36 @@
               <w:autoSpaceDE w:val="0"/>
               <w:autoSpaceDN w:val="0"/>
               <w:adjustRightInd w:val="0"/>
-              <w:spacing w:after="0" w:line="200" w:lineRule="exact"/>
-              <w:rPr>
-                <w:rFonts w:ascii="Times New Roman" w:hAnsi="Times New Roman"/>
-                <w:sz w:val="24"/>
-                <w:szCs w:val="24"/>
+              <w:spacing w:after="0" w:line="240" w:lineRule="auto"/>
+              <w:jc w:val="both"/>
+              <w:rPr>
+                <w:rFonts w:ascii="Times New Roman" w:hAnsi="Times New Roman"/>
                 <w:lang w:val="es-ES"/>
               </w:rPr>
             </w:pPr>
             <w:r>
               <w:rPr>
                 <w:rFonts w:ascii="Times New Roman" w:hAnsi="Times New Roman"/>
-                <w:sz w:val="24"/>
-                <w:szCs w:val="24"/>
-                <w:lang w:val="es-ES"/>
-              </w:rPr>
-              <w:t>Francisco</w:t>
-            </w:r>
-            <w:r>
-              <w:rPr>
-                <w:rFonts w:ascii="Times New Roman" w:hAnsi="Times New Roman"/>
-                <w:sz w:val="24"/>
-                <w:szCs w:val="24"/>
-                <w:lang w:val="es-ES"/>
-              </w:rPr>
-              <w:t xml:space="preserve"> </w:t>
-            </w:r>
-            <w:r>
-              <w:rPr>
-                <w:rFonts w:ascii="Times New Roman" w:hAnsi="Times New Roman"/>
-                <w:sz w:val="24"/>
-                <w:szCs w:val="24"/>
-                <w:lang w:val="es-ES"/>
-              </w:rPr>
-              <w:t>Javier</w:t>
-            </w:r>
-            <w:r>
-              <w:rPr>
-                <w:rFonts w:ascii="Times New Roman" w:hAnsi="Times New Roman"/>
-                <w:sz w:val="24"/>
-                <w:szCs w:val="24"/>
-                <w:lang w:val="es-ES"/>
-              </w:rPr>
-              <w:t xml:space="preserve"> </w:t>
-            </w:r>
-            <w:r>
-              <w:rPr>
-                <w:rFonts w:ascii="Times New Roman" w:hAnsi="Times New Roman"/>
-                <w:sz w:val="24"/>
-                <w:szCs w:val="24"/>
-                <w:lang w:val="es-ES"/>
-              </w:rPr>
-              <w:t>Gil</w:t>
-            </w:r>
-            <w:r>
-              <w:rPr>
-                <w:rFonts w:ascii="Times New Roman" w:hAnsi="Times New Roman"/>
-                <w:sz w:val="24"/>
-                <w:szCs w:val="24"/>
-                <w:lang w:val="es-ES"/>
-              </w:rPr>
-              <w:t xml:space="preserve"> </w:t>
-            </w:r>
-            <w:r>
-              <w:rPr>
-                <w:rFonts w:ascii="Times New Roman" w:hAnsi="Times New Roman"/>
-                <w:sz w:val="24"/>
-                <w:szCs w:val="24"/>
-                <w:lang w:val="es-ES"/>
-              </w:rPr>
-              <w:t>Rubio</w:t>
+                <w:lang w:val="es-ES"/>
+              </w:rPr>
+              <w:t>Francisco Javier Gil Rubio</w:t>
             </w:r>
           </w:p>
         </w:tc>
       </w:tr>
       <w:tr>
         <w:trPr>
-          <w:trHeight w:val="702"/>
+          <w:trHeight w:val="361"/>
         </w:trPr>
         <w:tc>
           <w:tcPr>
-            <w:tcW w:w="2235" w:type="dxa"/>
+            <w:tcW w:w="2122" w:type="dxa"/>
             <w:vAlign w:val="center"/>
           </w:tcPr>
           <w:p>
             <w:pPr>
               <w:pStyle w:val="Texto"/>
+              <w:jc w:val="both"/>
               <w:rPr>
                 <w:b/>
                 <w:lang w:val="es-ES"/>
@@ -540,7 +410,7 @@
         </w:tc>
         <w:tc>
           <w:tcPr>
-            <w:tcW w:w="7512" w:type="dxa"/>
+            <w:tcW w:w="7625" w:type="dxa"/>
             <w:gridSpan w:val="2"/>
             <w:vAlign w:val="center"/>
           </w:tcPr>
@@ -550,38 +420,29 @@
               <w:autoSpaceDE w:val="0"/>
               <w:autoSpaceDN w:val="0"/>
               <w:adjustRightInd w:val="0"/>
-              <w:spacing w:after="0" w:line="200" w:lineRule="exact"/>
-              <w:rPr>
-                <w:rFonts w:ascii="Times New Roman" w:hAnsi="Times New Roman"/>
-                <w:sz w:val="24"/>
-                <w:szCs w:val="24"/>
+              <w:spacing w:after="0" w:line="240" w:lineRule="auto"/>
+              <w:jc w:val="both"/>
+              <w:rPr>
+                <w:rFonts w:ascii="Times New Roman" w:hAnsi="Times New Roman"/>
                 <w:lang w:val="es-ES"/>
               </w:rPr>
             </w:pPr>
-            <w:r>
-              <w:rPr>
-                <w:rFonts w:ascii="Times New Roman" w:hAnsi="Times New Roman"/>
-                <w:sz w:val="24"/>
-                <w:szCs w:val="24"/>
-                <w:lang w:val="es-ES"/>
-              </w:rPr>
-              <w:t>Isabel De La Torre Diez</w:t>
-            </w:r>
           </w:p>
         </w:tc>
       </w:tr>
       <w:tr>
         <w:trPr>
-          <w:trHeight w:val="676"/>
+          <w:trHeight w:val="423"/>
         </w:trPr>
         <w:tc>
           <w:tcPr>
-            <w:tcW w:w="2235" w:type="dxa"/>
+            <w:tcW w:w="2122" w:type="dxa"/>
             <w:vAlign w:val="center"/>
           </w:tcPr>
           <w:p>
             <w:pPr>
               <w:pStyle w:val="Texto"/>
+              <w:jc w:val="both"/>
               <w:rPr>
                 <w:b/>
                 <w:lang w:val="es-ES"/>
@@ -605,7 +466,7 @@
         </w:tc>
         <w:tc>
           <w:tcPr>
-            <w:tcW w:w="7512" w:type="dxa"/>
+            <w:tcW w:w="7625" w:type="dxa"/>
             <w:gridSpan w:val="2"/>
             <w:vAlign w:val="center"/>
           </w:tcPr>
@@ -615,14 +476,170 @@
               <w:autoSpaceDE w:val="0"/>
               <w:autoSpaceDN w:val="0"/>
               <w:adjustRightInd w:val="0"/>
-              <w:spacing w:after="0" w:line="200" w:lineRule="exact"/>
-              <w:rPr>
-                <w:rFonts w:ascii="Times New Roman" w:hAnsi="Times New Roman"/>
-                <w:sz w:val="24"/>
-                <w:szCs w:val="24"/>
+              <w:spacing w:after="0" w:line="240" w:lineRule="auto"/>
+              <w:jc w:val="both"/>
+              <w:rPr>
+                <w:rFonts w:ascii="Times New Roman" w:hAnsi="Times New Roman"/>
                 <w:lang w:val="es-ES"/>
               </w:rPr>
             </w:pPr>
+            <w:r>
+              <w:rPr>
+                <w:rFonts w:ascii="Times New Roman" w:hAnsi="Times New Roman"/>
+                <w:lang w:val="es-ES"/>
+              </w:rPr>
+              <w:t>Matheus Vieira Santos</w:t>
+            </w:r>
+            <w:r>
+              <w:rPr>
+                <w:rFonts w:ascii="Times New Roman" w:hAnsi="Times New Roman"/>
+                <w:lang w:val="es-ES"/>
+              </w:rPr>
+              <w:t xml:space="preserve">                                                  </w:t>
+            </w:r>
+            <w:r>
+              <w:rPr>
+                <w:rFonts w:ascii="Times New Roman" w:hAnsi="Times New Roman"/>
+                <w:lang w:val="es-ES"/>
+              </w:rPr>
+              <w:t>Fdo.</w:t>
+            </w:r>
+          </w:p>
+        </w:tc>
+      </w:tr>
+      <w:tr>
+        <w:trPr>
+          <w:trHeight w:val="2597"/>
+        </w:trPr>
+        <w:tc>
+          <w:tcPr>
+            <w:tcW w:w="2122" w:type="dxa"/>
+            <w:vAlign w:val="center"/>
+          </w:tcPr>
+          <w:p>
+            <w:pPr>
+              <w:pStyle w:val="Texto"/>
+              <w:jc w:val="both"/>
+              <w:rPr>
+                <w:b/>
+                <w:lang w:val="es-ES"/>
+              </w:rPr>
+            </w:pPr>
+            <w:r>
+              <w:rPr>
+                <w:b/>
+                <w:lang w:val="es-ES"/>
+              </w:rPr>
+              <w:t>Objetivos</w:t>
+            </w:r>
+          </w:p>
+        </w:tc>
+        <w:tc>
+          <w:tcPr>
+            <w:tcW w:w="7625" w:type="dxa"/>
+            <w:gridSpan w:val="2"/>
+            <w:vAlign w:val="center"/>
+          </w:tcPr>
+          <w:p>
+            <w:pPr>
+              <w:widowControl w:val="0"/>
+              <w:autoSpaceDE w:val="0"/>
+              <w:autoSpaceDN w:val="0"/>
+              <w:adjustRightInd w:val="0"/>
+              <w:spacing w:after="0" w:line="240" w:lineRule="auto"/>
+              <w:jc w:val="both"/>
+              <w:rPr>
+                <w:rFonts w:ascii="Times New Roman" w:hAnsi="Times New Roman"/>
+                <w:sz w:val="20"/>
+                <w:szCs w:val="20"/>
+                <w:lang w:val="es-ES"/>
+              </w:rPr>
+            </w:pPr>
+            <w:r>
+              <w:rPr>
+                <w:rFonts w:ascii="Times New Roman" w:hAnsi="Times New Roman"/>
+                <w:b/>
+                <w:bCs/>
+                <w:sz w:val="20"/>
+                <w:szCs w:val="20"/>
+                <w:lang w:val="es-ES"/>
+              </w:rPr>
+              <w:t>General</w:t>
+            </w:r>
+            <w:r>
+              <w:rPr>
+                <w:rFonts w:ascii="Times New Roman" w:hAnsi="Times New Roman"/>
+                <w:sz w:val="20"/>
+                <w:szCs w:val="20"/>
+                <w:lang w:val="es-ES"/>
+              </w:rPr>
+              <w:t>:</w:t>
+            </w:r>
+            <w:r>
+              <w:rPr>
+                <w:rFonts w:ascii="Times New Roman" w:hAnsi="Times New Roman"/>
+                <w:sz w:val="20"/>
+                <w:szCs w:val="20"/>
+                <w:lang w:val="es-ES"/>
+              </w:rPr>
+              <w:t xml:space="preserve"> </w:t>
+            </w:r>
+            <w:r>
+              <w:rPr>
+                <w:rFonts w:ascii="Times New Roman" w:hAnsi="Times New Roman"/>
+                <w:sz w:val="20"/>
+                <w:szCs w:val="20"/>
+                <w:lang w:val="es-ES"/>
+              </w:rPr>
+              <w:t xml:space="preserve">Consolidar </w:t>
+            </w:r>
+            <w:r>
+              <w:rPr>
+                <w:rFonts w:ascii="Times New Roman" w:hAnsi="Times New Roman"/>
+                <w:sz w:val="20"/>
+                <w:szCs w:val="20"/>
+                <w:lang w:val="es-ES"/>
+              </w:rPr>
+              <w:t>la</w:t>
+            </w:r>
+            <w:r>
+              <w:rPr>
+                <w:rFonts w:ascii="Times New Roman" w:hAnsi="Times New Roman"/>
+                <w:sz w:val="20"/>
+                <w:szCs w:val="20"/>
+                <w:lang w:val="es-ES"/>
+              </w:rPr>
+              <w:t xml:space="preserve"> solución tecnológica </w:t>
+            </w:r>
+            <w:proofErr w:type="spellStart"/>
+            <w:r>
+              <w:rPr>
+                <w:rFonts w:ascii="Times New Roman" w:hAnsi="Times New Roman"/>
+                <w:sz w:val="20"/>
+                <w:szCs w:val="20"/>
+                <w:lang w:val="es-ES"/>
+              </w:rPr>
+              <w:t>CRIApp</w:t>
+            </w:r>
+            <w:proofErr w:type="spellEnd"/>
+            <w:r>
+              <w:rPr>
+                <w:rFonts w:ascii="Times New Roman" w:hAnsi="Times New Roman"/>
+                <w:sz w:val="20"/>
+                <w:szCs w:val="20"/>
+                <w:lang w:val="es-ES"/>
+              </w:rPr>
+              <w:t xml:space="preserve"> </w:t>
+            </w:r>
+            <w:r>
+              <w:rPr>
+                <w:rFonts w:ascii="Times New Roman" w:hAnsi="Times New Roman"/>
+                <w:sz w:val="20"/>
+                <w:szCs w:val="20"/>
+                <w:lang w:val="es-ES"/>
+              </w:rPr>
+              <w:t>compuesta por una web API y una aplicación Android que apoye a familias en procesos de crianza, facilitando el seguimiento de respuestas, acceso a recursos educativos y participación comunitaria.</w:t>
+            </w:r>
           </w:p>
           <w:p>
             <w:pPr>
@@ -630,287 +647,35 @@
               <w:autoSpaceDE w:val="0"/>
               <w:autoSpaceDN w:val="0"/>
               <w:adjustRightInd w:val="0"/>
-              <w:spacing w:after="0" w:line="200" w:lineRule="exact"/>
-              <w:rPr>
-                <w:rFonts w:ascii="Times New Roman" w:hAnsi="Times New Roman"/>
-                <w:sz w:val="24"/>
-                <w:szCs w:val="24"/>
+              <w:spacing w:after="0" w:line="240" w:lineRule="auto"/>
+              <w:jc w:val="both"/>
+              <w:rPr>
+                <w:rFonts w:ascii="Times New Roman" w:hAnsi="Times New Roman"/>
+                <w:sz w:val="20"/>
+                <w:szCs w:val="20"/>
                 <w:lang w:val="es-ES"/>
               </w:rPr>
             </w:pPr>
             <w:r>
-              <w:rPr>
-                <w:rFonts w:ascii="Times New Roman" w:hAnsi="Times New Roman"/>
-                <w:sz w:val="24"/>
-                <w:szCs w:val="24"/>
-                <w:lang w:val="es-ES"/>
-              </w:rPr>
-              <w:t>Matheus Vieira Santos</w:t>
-            </w:r>
-          </w:p>
-          <w:p>
-            <w:pPr>
-              <w:widowControl w:val="0"/>
-              <w:autoSpaceDE w:val="0"/>
-              <w:autoSpaceDN w:val="0"/>
-              <w:adjustRightInd w:val="0"/>
-              <w:spacing w:after="0" w:line="200" w:lineRule="exact"/>
-              <w:rPr>
-                <w:rFonts w:ascii="Times New Roman" w:hAnsi="Times New Roman"/>
-                <w:sz w:val="24"/>
-                <w:szCs w:val="24"/>
-                <w:lang w:val="es-ES"/>
-              </w:rPr>
-            </w:pPr>
-          </w:p>
-          <w:p>
-            <w:pPr>
-              <w:widowControl w:val="0"/>
-              <w:autoSpaceDE w:val="0"/>
-              <w:autoSpaceDN w:val="0"/>
-              <w:adjustRightInd w:val="0"/>
-              <w:spacing w:after="0" w:line="200" w:lineRule="exact"/>
-              <w:rPr>
-                <w:rFonts w:ascii="Times New Roman" w:hAnsi="Times New Roman"/>
-                <w:szCs w:val="24"/>
-                <w:lang w:val="es-ES"/>
-              </w:rPr>
-            </w:pPr>
-            <w:r>
-              <w:rPr>
-                <w:rFonts w:ascii="Times New Roman" w:hAnsi="Times New Roman"/>
-                <w:szCs w:val="24"/>
-                <w:lang w:val="es-ES"/>
-              </w:rPr>
-              <w:t>Fdo.</w:t>
-            </w:r>
-          </w:p>
-          <w:p>
-            <w:pPr>
-              <w:widowControl w:val="0"/>
-              <w:autoSpaceDE w:val="0"/>
-              <w:autoSpaceDN w:val="0"/>
-              <w:adjustRightInd w:val="0"/>
-              <w:spacing w:after="0" w:line="200" w:lineRule="exact"/>
-              <w:rPr>
-                <w:rFonts w:ascii="Times New Roman" w:hAnsi="Times New Roman"/>
-                <w:sz w:val="24"/>
-                <w:szCs w:val="24"/>
-                <w:lang w:val="es-ES"/>
-              </w:rPr>
-            </w:pPr>
-          </w:p>
-        </w:tc>
-      </w:tr>
-      <w:tr>
-        <w:trPr>
-          <w:trHeight w:val="1545"/>
-        </w:trPr>
-        <w:tc>
-          <w:tcPr>
-            <w:tcW w:w="2235" w:type="dxa"/>
-          </w:tcPr>
-          <w:p>
-            <w:pPr>
-              <w:pStyle w:val="Texto"/>
-              <w:rPr>
-                <w:b/>
-                <w:lang w:val="es-ES"/>
-              </w:rPr>
-            </w:pPr>
-            <w:r>
-              <w:rPr>
-                <w:b/>
-                <w:lang w:val="es-ES"/>
-              </w:rPr>
-              <w:t>Objetivos</w:t>
-            </w:r>
-          </w:p>
-        </w:tc>
-        <w:tc>
-          <w:tcPr>
-            <w:tcW w:w="7512" w:type="dxa"/>
-            <w:gridSpan w:val="2"/>
-          </w:tcPr>
-          <w:p>
-            <w:pPr>
-              <w:widowControl w:val="0"/>
-              <w:autoSpaceDE w:val="0"/>
-              <w:autoSpaceDN w:val="0"/>
-              <w:adjustRightInd w:val="0"/>
-              <w:spacing w:after="0" w:line="200" w:lineRule="exact"/>
               <w:rPr>
                 <w:rFonts w:ascii="Times New Roman" w:hAnsi="Times New Roman"/>
                 <w:b/>
                 <w:bCs/>
-                <w:sz w:val="24"/>
-                <w:szCs w:val="24"/>
-                <w:lang w:val="es-ES"/>
-              </w:rPr>
-            </w:pPr>
-          </w:p>
-          <w:p>
-            <w:pPr>
-              <w:widowControl w:val="0"/>
-              <w:autoSpaceDE w:val="0"/>
-              <w:autoSpaceDN w:val="0"/>
-              <w:adjustRightInd w:val="0"/>
-              <w:spacing w:after="0" w:line="200" w:lineRule="exact"/>
-              <w:rPr>
-                <w:rFonts w:ascii="Times New Roman" w:hAnsi="Times New Roman"/>
-                <w:sz w:val="24"/>
-                <w:szCs w:val="24"/>
-                <w:lang w:val="es-ES"/>
-              </w:rPr>
-            </w:pPr>
-            <w:r>
-              <w:rPr>
-                <w:rFonts w:ascii="Times New Roman" w:hAnsi="Times New Roman"/>
-                <w:b/>
-                <w:bCs/>
-                <w:sz w:val="24"/>
-                <w:szCs w:val="24"/>
-                <w:lang w:val="es-ES"/>
-              </w:rPr>
-              <w:t>General</w:t>
-            </w:r>
-            <w:r>
-              <w:rPr>
-                <w:rFonts w:ascii="Times New Roman" w:hAnsi="Times New Roman"/>
-                <w:sz w:val="24"/>
-                <w:szCs w:val="24"/>
+                <w:sz w:val="20"/>
+                <w:szCs w:val="20"/>
+                <w:lang w:val="es-ES"/>
+              </w:rPr>
+              <w:t>Específicos</w:t>
+            </w:r>
+            <w:r>
+              <w:rPr>
+                <w:rFonts w:ascii="Times New Roman" w:hAnsi="Times New Roman"/>
+                <w:sz w:val="20"/>
+                <w:szCs w:val="20"/>
                 <w:lang w:val="es-ES"/>
               </w:rPr>
               <w:t>:</w:t>
             </w:r>
-            <w:r>
-              <w:rPr>
-                <w:rFonts w:ascii="Times New Roman" w:hAnsi="Times New Roman"/>
-                <w:sz w:val="24"/>
-                <w:szCs w:val="24"/>
-                <w:lang w:val="es-ES"/>
-              </w:rPr>
-              <w:t xml:space="preserve"> </w:t>
-            </w:r>
-            <w:r>
-              <w:rPr>
-                <w:rFonts w:ascii="Times New Roman" w:hAnsi="Times New Roman"/>
-                <w:sz w:val="24"/>
-                <w:szCs w:val="24"/>
-                <w:lang w:val="es-ES"/>
-              </w:rPr>
-              <w:t xml:space="preserve">Consolidar </w:t>
-            </w:r>
-            <w:r>
-              <w:rPr>
-                <w:rFonts w:ascii="Times New Roman" w:hAnsi="Times New Roman"/>
-                <w:sz w:val="24"/>
-                <w:szCs w:val="24"/>
-                <w:lang w:val="es-ES"/>
-              </w:rPr>
-              <w:t>la</w:t>
-            </w:r>
-            <w:r>
-              <w:rPr>
-                <w:rFonts w:ascii="Times New Roman" w:hAnsi="Times New Roman"/>
-                <w:sz w:val="24"/>
-                <w:szCs w:val="24"/>
-                <w:lang w:val="es-ES"/>
-              </w:rPr>
-              <w:t xml:space="preserve"> solución tecnológica </w:t>
-            </w:r>
-            <w:proofErr w:type="spellStart"/>
-            <w:r>
-              <w:rPr>
-                <w:rFonts w:ascii="Times New Roman" w:hAnsi="Times New Roman"/>
-                <w:sz w:val="24"/>
-                <w:szCs w:val="24"/>
-                <w:lang w:val="es-ES"/>
-              </w:rPr>
-              <w:t>CRIApp</w:t>
-            </w:r>
-            <w:proofErr w:type="spellEnd"/>
-            <w:r>
-              <w:rPr>
-                <w:rFonts w:ascii="Times New Roman" w:hAnsi="Times New Roman"/>
-                <w:sz w:val="24"/>
-                <w:szCs w:val="24"/>
-                <w:lang w:val="es-ES"/>
-              </w:rPr>
-              <w:t xml:space="preserve"> </w:t>
-            </w:r>
-            <w:r>
-              <w:rPr>
-                <w:rFonts w:ascii="Times New Roman" w:hAnsi="Times New Roman"/>
-                <w:sz w:val="24"/>
-                <w:szCs w:val="24"/>
-                <w:lang w:val="es-ES"/>
-              </w:rPr>
-              <w:t>compuesta por una web API y una aplicación Android que apoye a familias en procesos de crianza, facilitando el seguimiento de respuestas, acceso a recursos educativos y participación comunitaria.</w:t>
-            </w:r>
-          </w:p>
-          <w:p>
-            <w:pPr>
-              <w:widowControl w:val="0"/>
-              <w:autoSpaceDE w:val="0"/>
-              <w:autoSpaceDN w:val="0"/>
-              <w:adjustRightInd w:val="0"/>
-              <w:spacing w:after="0" w:line="200" w:lineRule="exact"/>
-              <w:rPr>
-                <w:rFonts w:ascii="Times New Roman" w:hAnsi="Times New Roman"/>
-                <w:sz w:val="24"/>
-                <w:szCs w:val="24"/>
-                <w:lang w:val="es-ES"/>
-              </w:rPr>
-            </w:pPr>
-          </w:p>
-          <w:p>
-            <w:pPr>
-              <w:widowControl w:val="0"/>
-              <w:autoSpaceDE w:val="0"/>
-              <w:autoSpaceDN w:val="0"/>
-              <w:adjustRightInd w:val="0"/>
-              <w:spacing w:after="0" w:line="200" w:lineRule="exact"/>
-              <w:rPr>
-                <w:rFonts w:ascii="Times New Roman" w:hAnsi="Times New Roman"/>
-                <w:sz w:val="24"/>
-                <w:szCs w:val="24"/>
-                <w:lang w:val="es-ES"/>
-              </w:rPr>
-            </w:pPr>
-            <w:r>
-              <w:rPr>
-                <w:rFonts w:ascii="Times New Roman" w:hAnsi="Times New Roman"/>
-                <w:sz w:val="24"/>
-                <w:szCs w:val="24"/>
-                <w:lang w:val="es-ES"/>
-              </w:rPr>
-              <w:t>Específicos</w:t>
-            </w:r>
-            <w:r>
-              <w:rPr>
-                <w:rFonts w:ascii="Times New Roman" w:hAnsi="Times New Roman"/>
-                <w:sz w:val="24"/>
-                <w:szCs w:val="24"/>
-                <w:lang w:val="es-ES"/>
-              </w:rPr>
-              <w:t>:</w:t>
-            </w:r>
-          </w:p>
-          <w:p>
-            <w:pPr>
-              <w:widowControl w:val="0"/>
-              <w:autoSpaceDE w:val="0"/>
-              <w:autoSpaceDN w:val="0"/>
-              <w:adjustRightInd w:val="0"/>
-              <w:spacing w:after="0" w:line="200" w:lineRule="exact"/>
-              <w:rPr>
-                <w:rFonts w:ascii="Times New Roman" w:hAnsi="Times New Roman"/>
-                <w:sz w:val="24"/>
-                <w:szCs w:val="24"/>
-                <w:lang w:val="es-ES"/>
-              </w:rPr>
-            </w:pPr>
           </w:p>
           <w:p>
             <w:pPr>
@@ -923,19 +688,20 @@
               <w:autoSpaceDE w:val="0"/>
               <w:autoSpaceDN w:val="0"/>
               <w:adjustRightInd w:val="0"/>
-              <w:spacing w:after="0" w:line="200" w:lineRule="exact"/>
-              <w:rPr>
-                <w:rFonts w:ascii="Times New Roman" w:hAnsi="Times New Roman"/>
-                <w:sz w:val="24"/>
-                <w:szCs w:val="24"/>
+              <w:spacing w:after="0" w:line="240" w:lineRule="auto"/>
+              <w:jc w:val="both"/>
+              <w:rPr>
+                <w:rFonts w:ascii="Times New Roman" w:hAnsi="Times New Roman"/>
+                <w:sz w:val="20"/>
+                <w:szCs w:val="20"/>
                 <w:lang w:val="pt-ES"/>
               </w:rPr>
             </w:pPr>
             <w:r>
               <w:rPr>
                 <w:rFonts w:ascii="Times New Roman" w:hAnsi="Times New Roman"/>
-                <w:sz w:val="24"/>
-                <w:szCs w:val="24"/>
+                <w:sz w:val="20"/>
+                <w:szCs w:val="20"/>
                 <w:lang w:val="pt-ES"/>
               </w:rPr>
               <w:t xml:space="preserve">Documentar el proyecto </w:t>
@@ -943,8 +709,8 @@
             <w:r>
               <w:rPr>
                 <w:rFonts w:ascii="Times New Roman" w:hAnsi="Times New Roman"/>
-                <w:sz w:val="24"/>
-                <w:szCs w:val="24"/>
+                <w:sz w:val="20"/>
+                <w:szCs w:val="20"/>
                 <w:lang w:val="pt-ES"/>
               </w:rPr>
               <w:t>y el desarrollo existente</w:t>
@@ -961,19 +727,20 @@
               <w:autoSpaceDE w:val="0"/>
               <w:autoSpaceDN w:val="0"/>
               <w:adjustRightInd w:val="0"/>
-              <w:spacing w:after="0" w:line="200" w:lineRule="exact"/>
-              <w:rPr>
-                <w:rFonts w:ascii="Times New Roman" w:hAnsi="Times New Roman"/>
-                <w:sz w:val="24"/>
-                <w:szCs w:val="24"/>
+              <w:spacing w:after="0" w:line="240" w:lineRule="auto"/>
+              <w:jc w:val="both"/>
+              <w:rPr>
+                <w:rFonts w:ascii="Times New Roman" w:hAnsi="Times New Roman"/>
+                <w:sz w:val="20"/>
+                <w:szCs w:val="20"/>
                 <w:lang w:val="pt-ES"/>
               </w:rPr>
             </w:pPr>
             <w:r>
               <w:rPr>
                 <w:rFonts w:ascii="Times New Roman" w:hAnsi="Times New Roman"/>
-                <w:sz w:val="24"/>
-                <w:szCs w:val="24"/>
+                <w:sz w:val="20"/>
+                <w:szCs w:val="20"/>
                 <w:lang w:val="pt-ES"/>
               </w:rPr>
               <w:t xml:space="preserve">Gestionar el desarrollo siguiendo prácticas ágiles </w:t>
@@ -990,19 +757,20 @@
               <w:autoSpaceDE w:val="0"/>
               <w:autoSpaceDN w:val="0"/>
               <w:adjustRightInd w:val="0"/>
-              <w:spacing w:after="0" w:line="200" w:lineRule="exact"/>
-              <w:rPr>
-                <w:rFonts w:ascii="Times New Roman" w:hAnsi="Times New Roman"/>
-                <w:sz w:val="24"/>
-                <w:szCs w:val="24"/>
+              <w:spacing w:after="0" w:line="240" w:lineRule="auto"/>
+              <w:jc w:val="both"/>
+              <w:rPr>
+                <w:rFonts w:ascii="Times New Roman" w:hAnsi="Times New Roman"/>
+                <w:sz w:val="20"/>
+                <w:szCs w:val="20"/>
                 <w:lang w:val="pt-ES"/>
               </w:rPr>
             </w:pPr>
             <w:r>
               <w:rPr>
                 <w:rFonts w:ascii="Times New Roman" w:hAnsi="Times New Roman"/>
-                <w:sz w:val="24"/>
-                <w:szCs w:val="24"/>
+                <w:sz w:val="20"/>
+                <w:szCs w:val="20"/>
                 <w:lang w:val="pt-ES"/>
               </w:rPr>
               <w:t>Finalizar los flujos pendientes de premios</w:t>
@@ -1010,8 +778,8 @@
             <w:r>
               <w:rPr>
                 <w:rFonts w:ascii="Times New Roman" w:hAnsi="Times New Roman"/>
-                <w:sz w:val="24"/>
-                <w:szCs w:val="24"/>
+                <w:sz w:val="20"/>
+                <w:szCs w:val="20"/>
                 <w:lang w:val="pt-ES"/>
               </w:rPr>
               <w:t xml:space="preserve"> y</w:t>
@@ -1019,8 +787,8 @@
             <w:r>
               <w:rPr>
                 <w:rFonts w:ascii="Times New Roman" w:hAnsi="Times New Roman"/>
-                <w:sz w:val="24"/>
-                <w:szCs w:val="24"/>
+                <w:sz w:val="20"/>
+                <w:szCs w:val="20"/>
                 <w:lang w:val="pt-ES"/>
               </w:rPr>
               <w:t xml:space="preserve"> notificaciones</w:t>
@@ -1037,64 +805,29 @@
               <w:autoSpaceDE w:val="0"/>
               <w:autoSpaceDN w:val="0"/>
               <w:adjustRightInd w:val="0"/>
-              <w:spacing w:after="0" w:line="200" w:lineRule="exact"/>
-              <w:rPr>
-                <w:rFonts w:ascii="Times New Roman" w:hAnsi="Times New Roman"/>
-                <w:sz w:val="24"/>
-                <w:szCs w:val="24"/>
+              <w:spacing w:after="0" w:line="240" w:lineRule="auto"/>
+              <w:jc w:val="both"/>
+              <w:rPr>
+                <w:rFonts w:ascii="Times New Roman" w:hAnsi="Times New Roman"/>
+                <w:sz w:val="20"/>
+                <w:szCs w:val="20"/>
                 <w:lang w:val="pt-ES"/>
               </w:rPr>
             </w:pPr>
             <w:r>
               <w:rPr>
                 <w:rFonts w:ascii="Times New Roman" w:hAnsi="Times New Roman"/>
-                <w:sz w:val="24"/>
-                <w:szCs w:val="24"/>
-                <w:lang w:val="pt-ES"/>
-              </w:rPr>
-              <w:t xml:space="preserve">Refactorizar la </w:t>
-            </w:r>
-            <w:r>
-              <w:rPr>
-                <w:rFonts w:ascii="Times New Roman" w:hAnsi="Times New Roman"/>
-                <w:sz w:val="24"/>
-                <w:szCs w:val="24"/>
-                <w:lang w:val="pt-ES"/>
-              </w:rPr>
-              <w:t>A</w:t>
-            </w:r>
-            <w:r>
-              <w:rPr>
-                <w:rFonts w:ascii="Times New Roman" w:hAnsi="Times New Roman"/>
-                <w:sz w:val="24"/>
-                <w:szCs w:val="24"/>
-                <w:lang w:val="pt-ES"/>
-              </w:rPr>
-              <w:t xml:space="preserve">pp Android </w:t>
-            </w:r>
-            <w:r>
-              <w:rPr>
-                <w:rFonts w:ascii="Times New Roman" w:hAnsi="Times New Roman"/>
-                <w:sz w:val="24"/>
-                <w:szCs w:val="24"/>
-                <w:lang w:val="pt-ES"/>
-              </w:rPr>
-              <w:t>para mejorar su</w:t>
-            </w:r>
-            <w:r>
-              <w:rPr>
-                <w:rFonts w:ascii="Times New Roman" w:hAnsi="Times New Roman"/>
-                <w:sz w:val="24"/>
-                <w:szCs w:val="24"/>
-                <w:lang w:val="pt-ES"/>
-              </w:rPr>
-              <w:t xml:space="preserve"> mantenibilidad</w:t>
-            </w:r>
-            <w:r>
-              <w:rPr>
-                <w:rFonts w:ascii="Times New Roman" w:hAnsi="Times New Roman"/>
-                <w:sz w:val="24"/>
-                <w:szCs w:val="24"/>
+                <w:sz w:val="20"/>
+                <w:szCs w:val="20"/>
+                <w:lang w:val="pt-ES"/>
+              </w:rPr>
+              <w:t>Refactorizar la App Android para mejorar su mantenibilidad</w:t>
+            </w:r>
+            <w:r>
+              <w:rPr>
+                <w:rFonts w:ascii="Times New Roman" w:hAnsi="Times New Roman"/>
+                <w:sz w:val="20"/>
+                <w:szCs w:val="20"/>
                 <w:lang w:val="pt-ES"/>
               </w:rPr>
               <w:t xml:space="preserve"> y </w:t>
@@ -1102,8 +835,8 @@
             <w:r>
               <w:rPr>
                 <w:rFonts w:ascii="Times New Roman" w:hAnsi="Times New Roman"/>
-                <w:sz w:val="24"/>
-                <w:szCs w:val="24"/>
+                <w:sz w:val="20"/>
+                <w:szCs w:val="20"/>
                 <w:lang w:val="pt-ES"/>
               </w:rPr>
               <w:t>robustez</w:t>
@@ -1120,40 +853,23 @@
               <w:autoSpaceDE w:val="0"/>
               <w:autoSpaceDN w:val="0"/>
               <w:adjustRightInd w:val="0"/>
-              <w:spacing w:after="0" w:line="200" w:lineRule="exact"/>
-              <w:rPr>
-                <w:rFonts w:ascii="Times New Roman" w:hAnsi="Times New Roman"/>
-                <w:sz w:val="24"/>
-                <w:szCs w:val="24"/>
+              <w:spacing w:after="0" w:line="240" w:lineRule="auto"/>
+              <w:jc w:val="both"/>
+              <w:rPr>
+                <w:rFonts w:ascii="Times New Roman" w:hAnsi="Times New Roman"/>
+                <w:sz w:val="20"/>
+                <w:szCs w:val="20"/>
                 <w:lang w:val="pt-ES"/>
               </w:rPr>
             </w:pPr>
             <w:r>
               <w:rPr>
                 <w:rFonts w:ascii="Times New Roman" w:hAnsi="Times New Roman"/>
-                <w:sz w:val="24"/>
-                <w:szCs w:val="24"/>
-                <w:lang w:val="pt-ES"/>
-              </w:rPr>
-              <w:t>Implementar</w:t>
-            </w:r>
-            <w:r>
-              <w:rPr>
-                <w:rFonts w:ascii="Times New Roman" w:hAnsi="Times New Roman"/>
-                <w:sz w:val="24"/>
-                <w:szCs w:val="24"/>
-                <w:lang w:val="pt-ES"/>
-              </w:rPr>
-              <w:t xml:space="preserve"> pruebas automatizadas en </w:t>
-            </w:r>
-            <w:r>
-              <w:rPr>
-                <w:rFonts w:ascii="Times New Roman" w:hAnsi="Times New Roman"/>
-                <w:sz w:val="24"/>
-                <w:szCs w:val="24"/>
-                <w:lang w:val="pt-ES"/>
-              </w:rPr>
-              <w:t>la API</w:t>
+                <w:sz w:val="20"/>
+                <w:szCs w:val="20"/>
+                <w:lang w:val="pt-ES"/>
+              </w:rPr>
+              <w:t>Implementar pruebas automatizadas en la API</w:t>
             </w:r>
           </w:p>
           <w:p>
@@ -1167,19 +883,20 @@
               <w:autoSpaceDE w:val="0"/>
               <w:autoSpaceDN w:val="0"/>
               <w:adjustRightInd w:val="0"/>
-              <w:spacing w:after="0" w:line="200" w:lineRule="exact"/>
-              <w:rPr>
-                <w:rFonts w:ascii="Times New Roman" w:hAnsi="Times New Roman"/>
-                <w:sz w:val="24"/>
-                <w:szCs w:val="24"/>
+              <w:spacing w:after="0" w:line="240" w:lineRule="auto"/>
+              <w:jc w:val="both"/>
+              <w:rPr>
+                <w:rFonts w:ascii="Times New Roman" w:hAnsi="Times New Roman"/>
+                <w:sz w:val="20"/>
+                <w:szCs w:val="20"/>
                 <w:lang w:val="pt-ES"/>
               </w:rPr>
             </w:pPr>
             <w:r>
               <w:rPr>
                 <w:rFonts w:ascii="Times New Roman" w:hAnsi="Times New Roman"/>
-                <w:sz w:val="24"/>
-                <w:szCs w:val="24"/>
+                <w:sz w:val="20"/>
+                <w:szCs w:val="20"/>
                 <w:lang w:val="pt-ES"/>
               </w:rPr>
               <w:t>Desplegar la API en una plataforma cloud</w:t>
@@ -1193,11 +910,13 @@
         </w:trPr>
         <w:tc>
           <w:tcPr>
-            <w:tcW w:w="2235" w:type="dxa"/>
+            <w:tcW w:w="2122" w:type="dxa"/>
+            <w:vAlign w:val="center"/>
           </w:tcPr>
           <w:p>
             <w:pPr>
               <w:pStyle w:val="Texto"/>
+              <w:jc w:val="both"/>
               <w:rPr>
                 <w:b/>
                 <w:lang w:val="es-ES"/>
@@ -1214,8 +933,9 @@
         </w:tc>
         <w:tc>
           <w:tcPr>
-            <w:tcW w:w="7512" w:type="dxa"/>
+            <w:tcW w:w="7625" w:type="dxa"/>
             <w:gridSpan w:val="2"/>
+            <w:vAlign w:val="center"/>
           </w:tcPr>
           <w:p>
             <w:pPr>
@@ -1223,26 +943,12 @@
               <w:autoSpaceDE w:val="0"/>
               <w:autoSpaceDN w:val="0"/>
               <w:adjustRightInd w:val="0"/>
-              <w:spacing w:after="0" w:line="200" w:lineRule="exact"/>
-              <w:rPr>
-                <w:rFonts w:ascii="Times New Roman" w:hAnsi="Times New Roman"/>
-                <w:sz w:val="24"/>
-                <w:szCs w:val="24"/>
-                <w:lang w:val="es-ES"/>
-              </w:rPr>
-            </w:pPr>
-          </w:p>
-          <w:p>
-            <w:pPr>
-              <w:widowControl w:val="0"/>
-              <w:autoSpaceDE w:val="0"/>
-              <w:autoSpaceDN w:val="0"/>
-              <w:adjustRightInd w:val="0"/>
-              <w:spacing w:after="0" w:line="200" w:lineRule="exact"/>
-              <w:rPr>
-                <w:rFonts w:ascii="Times New Roman" w:hAnsi="Times New Roman"/>
-                <w:sz w:val="24"/>
-                <w:szCs w:val="24"/>
+              <w:spacing w:after="0" w:line="240" w:lineRule="auto"/>
+              <w:jc w:val="both"/>
+              <w:rPr>
+                <w:rFonts w:ascii="Times New Roman" w:hAnsi="Times New Roman"/>
+                <w:sz w:val="20"/>
+                <w:szCs w:val="20"/>
                 <w:lang w:val="es-ES"/>
               </w:rPr>
             </w:pPr>
@@ -1250,8 +956,8 @@
             <w:r>
               <w:rPr>
                 <w:rFonts w:ascii="Times New Roman" w:hAnsi="Times New Roman"/>
-                <w:sz w:val="24"/>
-                <w:szCs w:val="24"/>
+                <w:sz w:val="20"/>
+                <w:szCs w:val="20"/>
                 <w:lang w:val="es-ES"/>
               </w:rPr>
               <w:t>CRIApp</w:t>
@@ -1260,8 +966,8 @@
             <w:r>
               <w:rPr>
                 <w:rFonts w:ascii="Times New Roman" w:hAnsi="Times New Roman"/>
-                <w:sz w:val="24"/>
-                <w:szCs w:val="24"/>
+                <w:sz w:val="20"/>
+                <w:szCs w:val="20"/>
                 <w:lang w:val="es-ES"/>
               </w:rPr>
               <w:t xml:space="preserve"> es una propuesta de apoyo digital a la crianza inspirada en mecánicas de aprendizaje guiado y retroalimentación continua. El sistema se estructura en dos componentes principales: una API </w:t>
@@ -1269,8 +975,8 @@
             <w:r>
               <w:rPr>
                 <w:rFonts w:ascii="Times New Roman" w:hAnsi="Times New Roman"/>
-                <w:sz w:val="24"/>
-                <w:szCs w:val="24"/>
+                <w:sz w:val="20"/>
+                <w:szCs w:val="20"/>
                 <w:lang w:val="es-ES"/>
               </w:rPr>
               <w:t>REST (</w:t>
@@ -1279,8 +985,8 @@
             <w:r>
               <w:rPr>
                 <w:rFonts w:ascii="Times New Roman" w:hAnsi="Times New Roman"/>
-                <w:sz w:val="24"/>
-                <w:szCs w:val="24"/>
+                <w:sz w:val="20"/>
+                <w:szCs w:val="20"/>
                 <w:lang w:val="es-ES"/>
               </w:rPr>
               <w:t>backend</w:t>
@@ -1289,8 +995,8 @@
             <w:r>
               <w:rPr>
                 <w:rFonts w:ascii="Times New Roman" w:hAnsi="Times New Roman"/>
-                <w:sz w:val="24"/>
-                <w:szCs w:val="24"/>
+                <w:sz w:val="20"/>
+                <w:szCs w:val="20"/>
                 <w:lang w:val="es-ES"/>
               </w:rPr>
               <w:t>)</w:t>
@@ -1298,8 +1004,8 @@
             <w:r>
               <w:rPr>
                 <w:rFonts w:ascii="Times New Roman" w:hAnsi="Times New Roman"/>
-                <w:sz w:val="24"/>
-                <w:szCs w:val="24"/>
+                <w:sz w:val="20"/>
+                <w:szCs w:val="20"/>
                 <w:lang w:val="es-ES"/>
               </w:rPr>
               <w:t xml:space="preserve"> para centralizar lógica de negocio y persistencia de datos, y una </w:t>
@@ -1307,8 +1013,8 @@
             <w:r>
               <w:rPr>
                 <w:rFonts w:ascii="Times New Roman" w:hAnsi="Times New Roman"/>
-                <w:sz w:val="24"/>
-                <w:szCs w:val="24"/>
+                <w:sz w:val="20"/>
+                <w:szCs w:val="20"/>
                 <w:lang w:val="es-ES"/>
               </w:rPr>
               <w:t>A</w:t>
@@ -1316,8 +1022,8 @@
             <w:r>
               <w:rPr>
                 <w:rFonts w:ascii="Times New Roman" w:hAnsi="Times New Roman"/>
-                <w:sz w:val="24"/>
-                <w:szCs w:val="24"/>
+                <w:sz w:val="20"/>
+                <w:szCs w:val="20"/>
                 <w:lang w:val="es-ES"/>
               </w:rPr>
               <w:t xml:space="preserve">pp Android </w:t>
@@ -1325,8 +1031,8 @@
             <w:r>
               <w:rPr>
                 <w:rFonts w:ascii="Times New Roman" w:hAnsi="Times New Roman"/>
-                <w:sz w:val="24"/>
-                <w:szCs w:val="24"/>
+                <w:sz w:val="20"/>
+                <w:szCs w:val="20"/>
                 <w:lang w:val="es-ES"/>
               </w:rPr>
               <w:t>(</w:t>
@@ -1335,8 +1041,8 @@
             <w:r>
               <w:rPr>
                 <w:rFonts w:ascii="Times New Roman" w:hAnsi="Times New Roman"/>
-                <w:sz w:val="24"/>
-                <w:szCs w:val="24"/>
+                <w:sz w:val="20"/>
+                <w:szCs w:val="20"/>
                 <w:lang w:val="es-ES"/>
               </w:rPr>
               <w:t>frontend</w:t>
@@ -1345,8 +1051,8 @@
             <w:r>
               <w:rPr>
                 <w:rFonts w:ascii="Times New Roman" w:hAnsi="Times New Roman"/>
-                <w:sz w:val="24"/>
-                <w:szCs w:val="24"/>
+                <w:sz w:val="20"/>
+                <w:szCs w:val="20"/>
                 <w:lang w:val="es-ES"/>
               </w:rPr>
               <w:t xml:space="preserve">) </w:t>
@@ -1354,8 +1060,8 @@
             <w:r>
               <w:rPr>
                 <w:rFonts w:ascii="Times New Roman" w:hAnsi="Times New Roman"/>
-                <w:sz w:val="24"/>
-                <w:szCs w:val="24"/>
+                <w:sz w:val="20"/>
+                <w:szCs w:val="20"/>
                 <w:lang w:val="es-ES"/>
               </w:rPr>
               <w:t>como interfaz</w:t>
@@ -1363,8 +1069,8 @@
             <w:r>
               <w:rPr>
                 <w:rFonts w:ascii="Times New Roman" w:hAnsi="Times New Roman"/>
-                <w:sz w:val="24"/>
-                <w:szCs w:val="24"/>
+                <w:sz w:val="20"/>
+                <w:szCs w:val="20"/>
                 <w:lang w:val="es-ES"/>
               </w:rPr>
               <w:t xml:space="preserve"> </w:t>
@@ -1372,47 +1078,26 @@
             <w:r>
               <w:rPr>
                 <w:rFonts w:ascii="Times New Roman" w:hAnsi="Times New Roman"/>
-                <w:sz w:val="24"/>
-                <w:szCs w:val="24"/>
+                <w:sz w:val="20"/>
+                <w:szCs w:val="20"/>
                 <w:lang w:val="es-ES"/>
               </w:rPr>
               <w:t>de uso para familias.</w:t>
             </w:r>
-          </w:p>
-          <w:p>
-            <w:pPr>
-              <w:widowControl w:val="0"/>
-              <w:autoSpaceDE w:val="0"/>
-              <w:autoSpaceDN w:val="0"/>
-              <w:adjustRightInd w:val="0"/>
-              <w:spacing w:after="0" w:line="200" w:lineRule="exact"/>
-              <w:rPr>
-                <w:rFonts w:ascii="Times New Roman" w:hAnsi="Times New Roman"/>
-                <w:sz w:val="24"/>
-                <w:szCs w:val="24"/>
-                <w:lang w:val="es-ES"/>
-              </w:rPr>
-            </w:pPr>
-          </w:p>
-          <w:p>
-            <w:pPr>
-              <w:widowControl w:val="0"/>
-              <w:autoSpaceDE w:val="0"/>
-              <w:autoSpaceDN w:val="0"/>
-              <w:adjustRightInd w:val="0"/>
-              <w:spacing w:after="0" w:line="200" w:lineRule="exact"/>
-              <w:rPr>
-                <w:rFonts w:ascii="Times New Roman" w:hAnsi="Times New Roman"/>
-                <w:sz w:val="24"/>
-                <w:szCs w:val="24"/>
-                <w:lang w:val="es-ES"/>
-              </w:rPr>
-            </w:pPr>
-            <w:r>
-              <w:rPr>
-                <w:rFonts w:ascii="Times New Roman" w:hAnsi="Times New Roman"/>
-                <w:sz w:val="24"/>
-                <w:szCs w:val="24"/>
+            <w:r>
+              <w:rPr>
+                <w:rFonts w:ascii="Times New Roman" w:hAnsi="Times New Roman"/>
+                <w:sz w:val="20"/>
+                <w:szCs w:val="20"/>
+                <w:lang w:val="es-ES"/>
+              </w:rPr>
+              <w:t xml:space="preserve"> </w:t>
+            </w:r>
+            <w:r>
+              <w:rPr>
+                <w:rFonts w:ascii="Times New Roman" w:hAnsi="Times New Roman"/>
+                <w:sz w:val="20"/>
+                <w:szCs w:val="20"/>
                 <w:lang w:val="es-ES"/>
               </w:rPr>
               <w:t xml:space="preserve">Desde la perspectiva funcional, </w:t>
@@ -1421,8 +1106,8 @@
             <w:r>
               <w:rPr>
                 <w:rFonts w:ascii="Times New Roman" w:hAnsi="Times New Roman"/>
-                <w:sz w:val="24"/>
-                <w:szCs w:val="24"/>
+                <w:sz w:val="20"/>
+                <w:szCs w:val="20"/>
                 <w:lang w:val="es-ES"/>
               </w:rPr>
               <w:t>CRIApp</w:t>
@@ -1431,8 +1116,8 @@
             <w:r>
               <w:rPr>
                 <w:rFonts w:ascii="Times New Roman" w:hAnsi="Times New Roman"/>
-                <w:sz w:val="24"/>
-                <w:szCs w:val="24"/>
+                <w:sz w:val="20"/>
+                <w:szCs w:val="20"/>
                 <w:lang w:val="es-ES"/>
               </w:rPr>
               <w:t xml:space="preserve"> incluye autenticación de usuarios, gestión de hijos, cuestionarios diarios, foros, FAQ</w:t>
@@ -1440,8 +1125,8 @@
             <w:r>
               <w:rPr>
                 <w:rFonts w:ascii="Times New Roman" w:hAnsi="Times New Roman"/>
-                <w:sz w:val="24"/>
-                <w:szCs w:val="24"/>
+                <w:sz w:val="20"/>
+                <w:szCs w:val="20"/>
                 <w:lang w:val="es-ES"/>
               </w:rPr>
               <w:t>,</w:t>
@@ -1449,8 +1134,8 @@
             <w:r>
               <w:rPr>
                 <w:rFonts w:ascii="Times New Roman" w:hAnsi="Times New Roman"/>
-                <w:sz w:val="24"/>
-                <w:szCs w:val="24"/>
+                <w:sz w:val="20"/>
+                <w:szCs w:val="20"/>
                 <w:lang w:val="es-ES"/>
               </w:rPr>
               <w:t xml:space="preserve"> recursos audiovisuales</w:t>
@@ -1458,8 +1143,8 @@
             <w:r>
               <w:rPr>
                 <w:rFonts w:ascii="Times New Roman" w:hAnsi="Times New Roman"/>
-                <w:sz w:val="24"/>
-                <w:szCs w:val="24"/>
+                <w:sz w:val="20"/>
+                <w:szCs w:val="20"/>
                 <w:lang w:val="es-ES"/>
               </w:rPr>
               <w:t>, notificaciones y premios</w:t>
@@ -1467,8 +1152,8 @@
             <w:r>
               <w:rPr>
                 <w:rFonts w:ascii="Times New Roman" w:hAnsi="Times New Roman"/>
-                <w:sz w:val="24"/>
-                <w:szCs w:val="24"/>
+                <w:sz w:val="20"/>
+                <w:szCs w:val="20"/>
                 <w:lang w:val="es-ES"/>
               </w:rPr>
               <w:t xml:space="preserve">. Desde la perspectiva de cierre académico del TFM, el </w:t>
@@ -1476,8 +1161,8 @@
             <w:r>
               <w:rPr>
                 <w:rFonts w:ascii="Times New Roman" w:hAnsi="Times New Roman"/>
-                <w:sz w:val="24"/>
-                <w:szCs w:val="24"/>
+                <w:sz w:val="20"/>
+                <w:szCs w:val="20"/>
                 <w:lang w:val="es-ES"/>
               </w:rPr>
               <w:t xml:space="preserve">presente </w:t>
@@ -1485,8 +1170,8 @@
             <w:r>
               <w:rPr>
                 <w:rFonts w:ascii="Times New Roman" w:hAnsi="Times New Roman"/>
-                <w:sz w:val="24"/>
-                <w:szCs w:val="24"/>
+                <w:sz w:val="20"/>
+                <w:szCs w:val="20"/>
                 <w:lang w:val="es-ES"/>
               </w:rPr>
               <w:t xml:space="preserve">proyecto </w:t>
@@ -1494,8 +1179,8 @@
             <w:r>
               <w:rPr>
                 <w:rFonts w:ascii="Times New Roman" w:hAnsi="Times New Roman"/>
-                <w:sz w:val="24"/>
-                <w:szCs w:val="24"/>
+                <w:sz w:val="20"/>
+                <w:szCs w:val="20"/>
                 <w:lang w:val="es-ES"/>
               </w:rPr>
               <w:t>contempla</w:t>
@@ -1503,8 +1188,8 @@
             <w:r>
               <w:rPr>
                 <w:rFonts w:ascii="Times New Roman" w:hAnsi="Times New Roman"/>
-                <w:sz w:val="24"/>
-                <w:szCs w:val="24"/>
+                <w:sz w:val="20"/>
+                <w:szCs w:val="20"/>
                 <w:lang w:val="es-ES"/>
               </w:rPr>
               <w:t xml:space="preserve"> una fase de mejora y consolidación centrada en </w:t>
@@ -1512,8 +1197,8 @@
             <w:r>
               <w:rPr>
                 <w:rFonts w:ascii="Times New Roman" w:hAnsi="Times New Roman"/>
-                <w:sz w:val="24"/>
-                <w:szCs w:val="24"/>
+                <w:sz w:val="20"/>
+                <w:szCs w:val="20"/>
                 <w:lang w:val="es-ES"/>
               </w:rPr>
               <w:t>cuatro</w:t>
@@ -1521,26 +1206,17 @@
             <w:r>
               <w:rPr>
                 <w:rFonts w:ascii="Times New Roman" w:hAnsi="Times New Roman"/>
-                <w:sz w:val="24"/>
-                <w:szCs w:val="24"/>
-                <w:lang w:val="es-ES"/>
-              </w:rPr>
-              <w:t xml:space="preserve"> ejes: </w:t>
-            </w:r>
-            <w:r>
-              <w:rPr>
-                <w:rFonts w:ascii="Times New Roman" w:hAnsi="Times New Roman"/>
-                <w:sz w:val="24"/>
-                <w:szCs w:val="24"/>
-                <w:lang w:val="es-ES"/>
-              </w:rPr>
-              <w:t xml:space="preserve">(i) </w:t>
-            </w:r>
-            <w:r>
-              <w:rPr>
-                <w:rFonts w:ascii="Times New Roman" w:hAnsi="Times New Roman"/>
-                <w:sz w:val="24"/>
-                <w:szCs w:val="24"/>
+                <w:sz w:val="20"/>
+                <w:szCs w:val="20"/>
+                <w:lang w:val="es-ES"/>
+              </w:rPr>
+              <w:t xml:space="preserve"> ejes: (i) </w:t>
+            </w:r>
+            <w:r>
+              <w:rPr>
+                <w:rFonts w:ascii="Times New Roman" w:hAnsi="Times New Roman"/>
+                <w:sz w:val="20"/>
+                <w:szCs w:val="20"/>
                 <w:lang w:val="es-ES"/>
               </w:rPr>
               <w:t>finalizar</w:t>
@@ -1548,8 +1224,8 @@
             <w:r>
               <w:rPr>
                 <w:rFonts w:ascii="Times New Roman" w:hAnsi="Times New Roman"/>
-                <w:sz w:val="24"/>
-                <w:szCs w:val="24"/>
+                <w:sz w:val="20"/>
+                <w:szCs w:val="20"/>
                 <w:lang w:val="es-ES"/>
               </w:rPr>
               <w:t xml:space="preserve"> de flujos pendientes de </w:t>
@@ -1557,8 +1233,8 @@
             <w:r>
               <w:rPr>
                 <w:rFonts w:ascii="Times New Roman" w:hAnsi="Times New Roman"/>
-                <w:sz w:val="24"/>
-                <w:szCs w:val="24"/>
+                <w:sz w:val="20"/>
+                <w:szCs w:val="20"/>
                 <w:lang w:val="pt-ES"/>
               </w:rPr>
               <w:t>premios</w:t>
@@ -1566,8 +1242,8 @@
             <w:r>
               <w:rPr>
                 <w:rFonts w:ascii="Times New Roman" w:hAnsi="Times New Roman"/>
-                <w:sz w:val="24"/>
-                <w:szCs w:val="24"/>
+                <w:sz w:val="20"/>
+                <w:szCs w:val="20"/>
                 <w:lang w:val="pt-ES"/>
               </w:rPr>
               <w:t xml:space="preserve"> y </w:t>
@@ -1575,8 +1251,8 @@
             <w:r>
               <w:rPr>
                 <w:rFonts w:ascii="Times New Roman" w:hAnsi="Times New Roman"/>
-                <w:sz w:val="24"/>
-                <w:szCs w:val="24"/>
+                <w:sz w:val="20"/>
+                <w:szCs w:val="20"/>
                 <w:lang w:val="pt-ES"/>
               </w:rPr>
               <w:t>notificaciones</w:t>
@@ -1584,8 +1260,8 @@
             <w:r>
               <w:rPr>
                 <w:rFonts w:ascii="Times New Roman" w:hAnsi="Times New Roman"/>
-                <w:sz w:val="24"/>
-                <w:szCs w:val="24"/>
+                <w:sz w:val="20"/>
+                <w:szCs w:val="20"/>
                 <w:lang w:val="pt-ES"/>
               </w:rPr>
               <w:t xml:space="preserve"> </w:t>
@@ -1593,8 +1269,8 @@
             <w:r>
               <w:rPr>
                 <w:rFonts w:ascii="Times New Roman" w:hAnsi="Times New Roman"/>
-                <w:sz w:val="24"/>
-                <w:szCs w:val="24"/>
+                <w:sz w:val="20"/>
+                <w:szCs w:val="20"/>
                 <w:lang w:val="es-ES"/>
               </w:rPr>
               <w:t>(</w:t>
@@ -1603,27 +1279,18 @@
             <w:r>
               <w:rPr>
                 <w:rFonts w:ascii="Times New Roman" w:hAnsi="Times New Roman"/>
-                <w:sz w:val="24"/>
-                <w:szCs w:val="24"/>
-                <w:lang w:val="es-ES"/>
-              </w:rPr>
-              <w:t>i</w:t>
-            </w:r>
-            <w:r>
-              <w:rPr>
-                <w:rFonts w:ascii="Times New Roman" w:hAnsi="Times New Roman"/>
-                <w:sz w:val="24"/>
-                <w:szCs w:val="24"/>
-                <w:lang w:val="es-ES"/>
-              </w:rPr>
-              <w:t>i</w:t>
+                <w:sz w:val="20"/>
+                <w:szCs w:val="20"/>
+                <w:lang w:val="es-ES"/>
+              </w:rPr>
+              <w:t>ii</w:t>
             </w:r>
             <w:proofErr w:type="spellEnd"/>
             <w:r>
               <w:rPr>
                 <w:rFonts w:ascii="Times New Roman" w:hAnsi="Times New Roman"/>
-                <w:sz w:val="24"/>
-                <w:szCs w:val="24"/>
+                <w:sz w:val="20"/>
+                <w:szCs w:val="20"/>
                 <w:lang w:val="es-ES"/>
               </w:rPr>
               <w:t xml:space="preserve">) </w:t>
@@ -1632,8 +1299,8 @@
             <w:r>
               <w:rPr>
                 <w:rFonts w:ascii="Times New Roman" w:hAnsi="Times New Roman"/>
-                <w:sz w:val="24"/>
-                <w:szCs w:val="24"/>
+                <w:sz w:val="20"/>
+                <w:szCs w:val="20"/>
                 <w:lang w:val="es-ES"/>
               </w:rPr>
               <w:t>refactor</w:t>
@@ -1642,27 +1309,18 @@
             <w:r>
               <w:rPr>
                 <w:rFonts w:ascii="Times New Roman" w:hAnsi="Times New Roman"/>
-                <w:sz w:val="24"/>
-                <w:szCs w:val="24"/>
-                <w:lang w:val="es-ES"/>
-              </w:rPr>
-              <w:t xml:space="preserve"> arquitectónico de </w:t>
-            </w:r>
-            <w:r>
-              <w:rPr>
-                <w:rFonts w:ascii="Times New Roman" w:hAnsi="Times New Roman"/>
-                <w:sz w:val="24"/>
-                <w:szCs w:val="24"/>
-                <w:lang w:val="es-ES"/>
-              </w:rPr>
-              <w:t xml:space="preserve">la </w:t>
+                <w:sz w:val="20"/>
+                <w:szCs w:val="20"/>
+                <w:lang w:val="es-ES"/>
+              </w:rPr>
+              <w:t xml:space="preserve"> arquitectónico de la </w:t>
             </w:r>
             <w:proofErr w:type="gramStart"/>
             <w:r>
               <w:rPr>
                 <w:rFonts w:ascii="Times New Roman" w:hAnsi="Times New Roman"/>
-                <w:sz w:val="24"/>
-                <w:szCs w:val="24"/>
+                <w:sz w:val="20"/>
+                <w:szCs w:val="20"/>
                 <w:lang w:val="es-ES"/>
               </w:rPr>
               <w:t>app</w:t>
@@ -1671,8 +1329,93 @@
             <w:r>
               <w:rPr>
                 <w:rFonts w:ascii="Times New Roman" w:hAnsi="Times New Roman"/>
-                <w:sz w:val="24"/>
-                <w:szCs w:val="24"/>
+                <w:sz w:val="20"/>
+                <w:szCs w:val="20"/>
+                <w:lang w:val="es-ES"/>
+              </w:rPr>
+              <w:t xml:space="preserve"> Android según buenas prácticas, (</w:t>
+            </w:r>
+            <w:proofErr w:type="spellStart"/>
+            <w:r>
+              <w:rPr>
+                <w:rFonts w:ascii="Times New Roman" w:hAnsi="Times New Roman"/>
+                <w:sz w:val="20"/>
+                <w:szCs w:val="20"/>
+                <w:lang w:val="es-ES"/>
+              </w:rPr>
+              <w:t>iii</w:t>
+            </w:r>
+            <w:proofErr w:type="spellEnd"/>
+            <w:r>
+              <w:rPr>
+                <w:rFonts w:ascii="Times New Roman" w:hAnsi="Times New Roman"/>
+                <w:sz w:val="20"/>
+                <w:szCs w:val="20"/>
+                <w:lang w:val="es-ES"/>
+              </w:rPr>
+              <w:t>) incremento de calidad mediante pruebas automatizadas</w:t>
+            </w:r>
+            <w:r>
+              <w:rPr>
+                <w:rFonts w:ascii="Times New Roman" w:hAnsi="Times New Roman"/>
+                <w:sz w:val="20"/>
+                <w:szCs w:val="20"/>
+                <w:lang w:val="es-ES"/>
+              </w:rPr>
+              <w:t xml:space="preserve"> en la API</w:t>
+            </w:r>
+            <w:r>
+              <w:rPr>
+                <w:rFonts w:ascii="Times New Roman" w:hAnsi="Times New Roman"/>
+                <w:sz w:val="20"/>
+                <w:szCs w:val="20"/>
+                <w:lang w:val="es-ES"/>
+              </w:rPr>
+              <w:t>, y (</w:t>
+            </w:r>
+            <w:proofErr w:type="spellStart"/>
+            <w:r>
+              <w:rPr>
+                <w:rFonts w:ascii="Times New Roman" w:hAnsi="Times New Roman"/>
+                <w:sz w:val="20"/>
+                <w:szCs w:val="20"/>
+                <w:lang w:val="es-ES"/>
+              </w:rPr>
+              <w:t>iv</w:t>
+            </w:r>
+            <w:proofErr w:type="spellEnd"/>
+            <w:r>
+              <w:rPr>
+                <w:rFonts w:ascii="Times New Roman" w:hAnsi="Times New Roman"/>
+                <w:sz w:val="20"/>
+                <w:szCs w:val="20"/>
+                <w:lang w:val="es-ES"/>
+              </w:rPr>
+              <w:t xml:space="preserve">) despliegue </w:t>
+            </w:r>
+            <w:r>
+              <w:rPr>
+                <w:rFonts w:ascii="Times New Roman" w:hAnsi="Times New Roman"/>
+                <w:sz w:val="20"/>
+                <w:szCs w:val="20"/>
+                <w:lang w:val="es-ES"/>
+              </w:rPr>
+              <w:t xml:space="preserve">de la API </w:t>
+            </w:r>
+            <w:r>
+              <w:rPr>
+                <w:rFonts w:ascii="Times New Roman" w:hAnsi="Times New Roman"/>
+                <w:sz w:val="20"/>
+                <w:szCs w:val="20"/>
+                <w:lang w:val="es-ES"/>
+              </w:rPr>
+              <w:t>en nube como evidencia de aplicabilidad real.</w:t>
+            </w:r>
+            <w:r>
+              <w:rPr>
+                <w:rFonts w:ascii="Times New Roman" w:hAnsi="Times New Roman"/>
+                <w:sz w:val="20"/>
+                <w:szCs w:val="20"/>
                 <w:lang w:val="es-ES"/>
               </w:rPr>
               <w:t xml:space="preserve"> </w:t>
@@ -1680,132 +1423,8 @@
             <w:r>
               <w:rPr>
                 <w:rFonts w:ascii="Times New Roman" w:hAnsi="Times New Roman"/>
-                <w:sz w:val="24"/>
-                <w:szCs w:val="24"/>
-                <w:lang w:val="es-ES"/>
-              </w:rPr>
-              <w:t>Android según buenas prácticas, (</w:t>
-            </w:r>
-            <w:proofErr w:type="spellStart"/>
-            <w:r>
-              <w:rPr>
-                <w:rFonts w:ascii="Times New Roman" w:hAnsi="Times New Roman"/>
-                <w:sz w:val="24"/>
-                <w:szCs w:val="24"/>
-                <w:lang w:val="es-ES"/>
-              </w:rPr>
-              <w:t>ii</w:t>
-            </w:r>
-            <w:r>
-              <w:rPr>
-                <w:rFonts w:ascii="Times New Roman" w:hAnsi="Times New Roman"/>
-                <w:sz w:val="24"/>
-                <w:szCs w:val="24"/>
-                <w:lang w:val="es-ES"/>
-              </w:rPr>
-              <w:t>i</w:t>
-            </w:r>
-            <w:proofErr w:type="spellEnd"/>
-            <w:r>
-              <w:rPr>
-                <w:rFonts w:ascii="Times New Roman" w:hAnsi="Times New Roman"/>
-                <w:sz w:val="24"/>
-                <w:szCs w:val="24"/>
-                <w:lang w:val="es-ES"/>
-              </w:rPr>
-              <w:t>) incremento de calidad mediante pruebas automatizadas</w:t>
-            </w:r>
-            <w:r>
-              <w:rPr>
-                <w:rFonts w:ascii="Times New Roman" w:hAnsi="Times New Roman"/>
-                <w:sz w:val="24"/>
-                <w:szCs w:val="24"/>
-                <w:lang w:val="es-ES"/>
-              </w:rPr>
-              <w:t xml:space="preserve"> en la API</w:t>
-            </w:r>
-            <w:r>
-              <w:rPr>
-                <w:rFonts w:ascii="Times New Roman" w:hAnsi="Times New Roman"/>
-                <w:sz w:val="24"/>
-                <w:szCs w:val="24"/>
-                <w:lang w:val="es-ES"/>
-              </w:rPr>
-              <w:t>, y (</w:t>
-            </w:r>
-            <w:proofErr w:type="spellStart"/>
-            <w:r>
-              <w:rPr>
-                <w:rFonts w:ascii="Times New Roman" w:hAnsi="Times New Roman"/>
-                <w:sz w:val="24"/>
-                <w:szCs w:val="24"/>
-                <w:lang w:val="es-ES"/>
-              </w:rPr>
-              <w:t>iv</w:t>
-            </w:r>
-            <w:proofErr w:type="spellEnd"/>
-            <w:r>
-              <w:rPr>
-                <w:rFonts w:ascii="Times New Roman" w:hAnsi="Times New Roman"/>
-                <w:sz w:val="24"/>
-                <w:szCs w:val="24"/>
-                <w:lang w:val="es-ES"/>
-              </w:rPr>
-              <w:t xml:space="preserve">) despliegue </w:t>
-            </w:r>
-            <w:r>
-              <w:rPr>
-                <w:rFonts w:ascii="Times New Roman" w:hAnsi="Times New Roman"/>
-                <w:sz w:val="24"/>
-                <w:szCs w:val="24"/>
-                <w:lang w:val="es-ES"/>
-              </w:rPr>
-              <w:t xml:space="preserve">de la API </w:t>
-            </w:r>
-            <w:r>
-              <w:rPr>
-                <w:rFonts w:ascii="Times New Roman" w:hAnsi="Times New Roman"/>
-                <w:sz w:val="24"/>
-                <w:szCs w:val="24"/>
-                <w:lang w:val="es-ES"/>
-              </w:rPr>
-              <w:t>en nube como evidencia de aplicabilidad real.</w:t>
-            </w:r>
-          </w:p>
-          <w:p>
-            <w:pPr>
-              <w:widowControl w:val="0"/>
-              <w:autoSpaceDE w:val="0"/>
-              <w:autoSpaceDN w:val="0"/>
-              <w:adjustRightInd w:val="0"/>
-              <w:spacing w:after="0" w:line="200" w:lineRule="exact"/>
-              <w:rPr>
-                <w:rFonts w:ascii="Times New Roman" w:hAnsi="Times New Roman"/>
-                <w:sz w:val="24"/>
-                <w:szCs w:val="24"/>
-                <w:lang w:val="es-ES"/>
-              </w:rPr>
-            </w:pPr>
-          </w:p>
-          <w:p>
-            <w:pPr>
-              <w:widowControl w:val="0"/>
-              <w:autoSpaceDE w:val="0"/>
-              <w:autoSpaceDN w:val="0"/>
-              <w:adjustRightInd w:val="0"/>
-              <w:spacing w:after="0" w:line="200" w:lineRule="exact"/>
-              <w:rPr>
-                <w:rFonts w:ascii="Times New Roman" w:hAnsi="Times New Roman"/>
-                <w:sz w:val="24"/>
-                <w:szCs w:val="24"/>
-                <w:lang w:val="es-ES"/>
-              </w:rPr>
-            </w:pPr>
-            <w:r>
-              <w:rPr>
-                <w:rFonts w:ascii="Times New Roman" w:hAnsi="Times New Roman"/>
-                <w:sz w:val="24"/>
-                <w:szCs w:val="24"/>
+                <w:sz w:val="20"/>
+                <w:szCs w:val="20"/>
                 <w:lang w:val="es-ES"/>
               </w:rPr>
               <w:t>Metodológicamente, el trabajo se organiza con un enfoque ágil hibrido (Scrum semanal + flujo Kanban), apoyado en historias de usuario, criterios de aceptación y evidencias por iteración. Este planteamiento permite equilibrar desarrollo técnico y entregables académico</w:t>
@@ -1813,8 +1432,8 @@
             <w:r>
               <w:rPr>
                 <w:rFonts w:ascii="Times New Roman" w:hAnsi="Times New Roman"/>
-                <w:sz w:val="24"/>
-                <w:szCs w:val="24"/>
+                <w:sz w:val="20"/>
+                <w:szCs w:val="20"/>
                 <w:lang w:val="es-ES"/>
               </w:rPr>
               <w:t>s</w:t>
@@ -1822,42 +1441,29 @@
             <w:r>
               <w:rPr>
                 <w:rFonts w:ascii="Times New Roman" w:hAnsi="Times New Roman"/>
-                <w:sz w:val="24"/>
-                <w:szCs w:val="24"/>
+                <w:sz w:val="20"/>
+                <w:szCs w:val="20"/>
                 <w:lang w:val="es-ES"/>
               </w:rPr>
               <w:t>, manteniendo trazabilidad y control de alcance.</w:t>
             </w:r>
-          </w:p>
-          <w:p>
-            <w:pPr>
-              <w:widowControl w:val="0"/>
-              <w:autoSpaceDE w:val="0"/>
-              <w:autoSpaceDN w:val="0"/>
-              <w:adjustRightInd w:val="0"/>
-              <w:spacing w:after="0" w:line="200" w:lineRule="exact"/>
-              <w:rPr>
-                <w:rFonts w:ascii="Times New Roman" w:hAnsi="Times New Roman"/>
-                <w:sz w:val="24"/>
-                <w:szCs w:val="24"/>
-                <w:lang w:val="es-ES"/>
-              </w:rPr>
-            </w:pPr>
           </w:p>
         </w:tc>
       </w:tr>
       <w:tr>
         <w:trPr>
-          <w:trHeight w:val="2665"/>
+          <w:trHeight w:val="2187"/>
         </w:trPr>
         <w:tc>
           <w:tcPr>
-            <w:tcW w:w="2235" w:type="dxa"/>
+            <w:tcW w:w="2122" w:type="dxa"/>
             <w:vMerge w:val="restart"/>
+            <w:vAlign w:val="center"/>
           </w:tcPr>
           <w:p>
             <w:pPr>
               <w:pStyle w:val="Texto"/>
+              <w:jc w:val="both"/>
               <w:rPr>
                 <w:b/>
                 <w:lang w:val="es-ES"/>
@@ -1874,8 +1480,9 @@
         </w:tc>
         <w:tc>
           <w:tcPr>
-            <w:tcW w:w="7512" w:type="dxa"/>
+            <w:tcW w:w="7625" w:type="dxa"/>
             <w:gridSpan w:val="2"/>
+            <w:vAlign w:val="center"/>
           </w:tcPr>
           <w:p>
             <w:pPr>
@@ -1883,52 +1490,74 @@
               <w:autoSpaceDE w:val="0"/>
               <w:autoSpaceDN w:val="0"/>
               <w:adjustRightInd w:val="0"/>
-              <w:spacing w:after="0" w:line="200" w:lineRule="exact"/>
-              <w:rPr>
-                <w:rFonts w:ascii="Times New Roman" w:hAnsi="Times New Roman"/>
-                <w:sz w:val="24"/>
-                <w:szCs w:val="24"/>
+              <w:spacing w:after="0" w:line="240" w:lineRule="auto"/>
+              <w:jc w:val="both"/>
+              <w:rPr>
+                <w:rFonts w:ascii="Times New Roman" w:hAnsi="Times New Roman"/>
+                <w:sz w:val="20"/>
+                <w:szCs w:val="20"/>
                 <w:lang w:val="pt-ES"/>
               </w:rPr>
             </w:pPr>
-          </w:p>
-          <w:p>
-            <w:pPr>
-              <w:widowControl w:val="0"/>
-              <w:autoSpaceDE w:val="0"/>
-              <w:autoSpaceDN w:val="0"/>
-              <w:adjustRightInd w:val="0"/>
-              <w:spacing w:after="0" w:line="200" w:lineRule="exact"/>
-              <w:rPr>
-                <w:rFonts w:ascii="Times New Roman" w:hAnsi="Times New Roman"/>
-                <w:sz w:val="24"/>
-                <w:szCs w:val="24"/>
-                <w:lang w:val="pt-ES"/>
-              </w:rPr>
-            </w:pPr>
-            <w:r>
-              <w:rPr>
-                <w:rFonts w:ascii="Times New Roman" w:hAnsi="Times New Roman"/>
-                <w:sz w:val="24"/>
-                <w:szCs w:val="24"/>
-                <w:lang w:val="pt-ES"/>
-              </w:rPr>
-              <w:t xml:space="preserve">This </w:t>
-            </w:r>
-            <w:r>
-              <w:rPr>
-                <w:rFonts w:ascii="Times New Roman" w:hAnsi="Times New Roman"/>
-                <w:sz w:val="24"/>
-                <w:szCs w:val="24"/>
-                <w:lang w:val="pt-ES"/>
-              </w:rPr>
-              <w:t>project</w:t>
-            </w:r>
-            <w:r>
-              <w:rPr>
-                <w:rFonts w:ascii="Times New Roman" w:hAnsi="Times New Roman"/>
-                <w:sz w:val="24"/>
-                <w:szCs w:val="24"/>
+            <w:r>
+              <w:rPr>
+                <w:rFonts w:ascii="Times New Roman" w:hAnsi="Times New Roman"/>
+                <w:sz w:val="20"/>
+                <w:szCs w:val="20"/>
+                <w:lang w:val="pt-ES"/>
+              </w:rPr>
+              <w:t>This project aims to consolidate CRIApp, a web-and-mobile solution designed to support families in parenting processes through daily questionnaires, educational content, and community interaction. The system is composed of a REST API</w:t>
+            </w:r>
+            <w:r>
+              <w:rPr>
+                <w:rFonts w:ascii="Times New Roman" w:hAnsi="Times New Roman"/>
+                <w:sz w:val="20"/>
+                <w:szCs w:val="20"/>
+                <w:lang w:val="pt-ES"/>
+              </w:rPr>
+              <w:t xml:space="preserve"> (backend)</w:t>
+            </w:r>
+            <w:r>
+              <w:rPr>
+                <w:rFonts w:ascii="Times New Roman" w:hAnsi="Times New Roman"/>
+                <w:sz w:val="20"/>
+                <w:szCs w:val="20"/>
+                <w:lang w:val="pt-ES"/>
+              </w:rPr>
+              <w:t xml:space="preserve"> and an Android client application</w:t>
+            </w:r>
+            <w:r>
+              <w:rPr>
+                <w:rFonts w:ascii="Times New Roman" w:hAnsi="Times New Roman"/>
+                <w:sz w:val="20"/>
+                <w:szCs w:val="20"/>
+                <w:lang w:val="pt-ES"/>
+              </w:rPr>
+              <w:t xml:space="preserve"> (frontend)</w:t>
+            </w:r>
+            <w:r>
+              <w:rPr>
+                <w:rFonts w:ascii="Times New Roman" w:hAnsi="Times New Roman"/>
+                <w:sz w:val="20"/>
+                <w:szCs w:val="20"/>
+                <w:lang w:val="pt-ES"/>
+              </w:rPr>
+              <w:t xml:space="preserve">. At the current stage, the project focuses on: </w:t>
+            </w:r>
+            <w:r>
+              <w:rPr>
+                <w:rFonts w:ascii="Times New Roman" w:hAnsi="Times New Roman"/>
+                <w:sz w:val="20"/>
+                <w:szCs w:val="20"/>
+                <w:lang w:val="pt-ES"/>
+              </w:rPr>
+              <w:t>completing</w:t>
+            </w:r>
+            <w:r>
+              <w:rPr>
+                <w:rFonts w:ascii="Times New Roman" w:hAnsi="Times New Roman"/>
+                <w:sz w:val="20"/>
+                <w:szCs w:val="20"/>
                 <w:lang w:val="pt-ES"/>
               </w:rPr>
               <w:t xml:space="preserve"> </w:t>
@@ -1936,26 +1565,98 @@
             <w:r>
               <w:rPr>
                 <w:rFonts w:ascii="Times New Roman" w:hAnsi="Times New Roman"/>
-                <w:sz w:val="24"/>
-                <w:szCs w:val="24"/>
-                <w:lang w:val="pt-ES"/>
-              </w:rPr>
-              <w:t>aims to consolidate</w:t>
-            </w:r>
-            <w:r>
-              <w:rPr>
-                <w:rFonts w:ascii="Times New Roman" w:hAnsi="Times New Roman"/>
-                <w:sz w:val="24"/>
-                <w:szCs w:val="24"/>
-                <w:lang w:val="pt-ES"/>
-              </w:rPr>
-              <w:t xml:space="preserve"> CRIApp</w:t>
-            </w:r>
-            <w:r>
-              <w:rPr>
-                <w:rFonts w:ascii="Times New Roman" w:hAnsi="Times New Roman"/>
-                <w:sz w:val="24"/>
-                <w:szCs w:val="24"/>
+                <w:sz w:val="20"/>
+                <w:szCs w:val="20"/>
+                <w:lang w:val="pt-ES"/>
+              </w:rPr>
+              <w:t xml:space="preserve">the </w:t>
+            </w:r>
+            <w:r>
+              <w:rPr>
+                <w:rFonts w:ascii="Times New Roman" w:hAnsi="Times New Roman"/>
+                <w:sz w:val="20"/>
+                <w:szCs w:val="20"/>
+                <w:lang w:val="pt-ES"/>
+              </w:rPr>
+              <w:t>award</w:t>
+            </w:r>
+            <w:r>
+              <w:rPr>
+                <w:rFonts w:ascii="Times New Roman" w:hAnsi="Times New Roman"/>
+                <w:sz w:val="20"/>
+                <w:szCs w:val="20"/>
+                <w:lang w:val="pt-ES"/>
+              </w:rPr>
+              <w:t xml:space="preserve"> and </w:t>
+            </w:r>
+            <w:r>
+              <w:rPr>
+                <w:rFonts w:ascii="Times New Roman" w:hAnsi="Times New Roman"/>
+                <w:sz w:val="20"/>
+                <w:szCs w:val="20"/>
+                <w:lang w:val="pt-ES"/>
+              </w:rPr>
+              <w:t>notification</w:t>
+            </w:r>
+            <w:r>
+              <w:rPr>
+                <w:rFonts w:ascii="Times New Roman" w:hAnsi="Times New Roman"/>
+                <w:sz w:val="20"/>
+                <w:szCs w:val="20"/>
+                <w:lang w:val="pt-ES"/>
+              </w:rPr>
+              <w:t xml:space="preserve"> </w:t>
+            </w:r>
+            <w:r>
+              <w:rPr>
+                <w:rFonts w:ascii="Times New Roman" w:hAnsi="Times New Roman"/>
+                <w:sz w:val="20"/>
+                <w:szCs w:val="20"/>
+                <w:lang w:val="pt-ES"/>
+              </w:rPr>
+              <w:t>work</w:t>
+            </w:r>
+            <w:r>
+              <w:rPr>
+                <w:rFonts w:ascii="Times New Roman" w:hAnsi="Times New Roman"/>
+                <w:sz w:val="20"/>
+                <w:szCs w:val="20"/>
+                <w:lang w:val="pt-ES"/>
+              </w:rPr>
+              <w:t>flows</w:t>
+            </w:r>
+            <w:r>
+              <w:rPr>
+                <w:rFonts w:ascii="Times New Roman" w:hAnsi="Times New Roman"/>
+                <w:sz w:val="20"/>
+                <w:szCs w:val="20"/>
+                <w:lang w:val="pt-ES"/>
+              </w:rPr>
+              <w:t>;</w:t>
+            </w:r>
+            <w:r>
+              <w:rPr>
+                <w:rFonts w:ascii="Times New Roman" w:hAnsi="Times New Roman"/>
+                <w:sz w:val="20"/>
+                <w:szCs w:val="20"/>
+                <w:lang w:val="pt-ES"/>
+              </w:rPr>
+              <w:t xml:space="preserve"> </w:t>
+            </w:r>
+            <w:r>
+              <w:rPr>
+                <w:rFonts w:ascii="Times New Roman" w:hAnsi="Times New Roman"/>
+                <w:sz w:val="20"/>
+                <w:szCs w:val="20"/>
+                <w:lang w:val="pt-ES"/>
+              </w:rPr>
+              <w:t>Android refactoring according to software engineering patterns</w:t>
+            </w:r>
+            <w:r>
+              <w:rPr>
+                <w:rFonts w:ascii="Times New Roman" w:hAnsi="Times New Roman"/>
+                <w:sz w:val="20"/>
+                <w:szCs w:val="20"/>
                 <w:lang w:val="pt-ES"/>
               </w:rPr>
               <w:t xml:space="preserve">, </w:t>
@@ -1963,288 +1664,57 @@
             <w:r>
               <w:rPr>
                 <w:rFonts w:ascii="Times New Roman" w:hAnsi="Times New Roman"/>
-                <w:sz w:val="24"/>
-                <w:szCs w:val="24"/>
-                <w:lang w:val="pt-ES"/>
-              </w:rPr>
-              <w:t xml:space="preserve">a web-and-mobile solution </w:t>
-            </w:r>
-            <w:r>
-              <w:rPr>
-                <w:rFonts w:ascii="Times New Roman" w:hAnsi="Times New Roman"/>
-                <w:sz w:val="24"/>
-                <w:szCs w:val="24"/>
-                <w:lang w:val="pt-ES"/>
-              </w:rPr>
-              <w:t>designed</w:t>
-            </w:r>
-            <w:r>
-              <w:rPr>
-                <w:rFonts w:ascii="Times New Roman" w:hAnsi="Times New Roman"/>
-                <w:sz w:val="24"/>
-                <w:szCs w:val="24"/>
-                <w:lang w:val="pt-ES"/>
-              </w:rPr>
-              <w:t xml:space="preserve"> </w:t>
-            </w:r>
-            <w:r>
-              <w:rPr>
-                <w:rFonts w:ascii="Times New Roman" w:hAnsi="Times New Roman"/>
-                <w:sz w:val="24"/>
-                <w:szCs w:val="24"/>
-                <w:lang w:val="pt-ES"/>
-              </w:rPr>
-              <w:t>to support</w:t>
-            </w:r>
-            <w:r>
-              <w:rPr>
-                <w:rFonts w:ascii="Times New Roman" w:hAnsi="Times New Roman"/>
-                <w:sz w:val="24"/>
-                <w:szCs w:val="24"/>
-                <w:lang w:val="pt-ES"/>
-              </w:rPr>
-              <w:t xml:space="preserve"> families in parenting processes through daily questionnaires, educational content, and community interaction. The system is composed of a REST API</w:t>
-            </w:r>
-            <w:r>
-              <w:rPr>
-                <w:rFonts w:ascii="Times New Roman" w:hAnsi="Times New Roman"/>
-                <w:sz w:val="24"/>
-                <w:szCs w:val="24"/>
-                <w:lang w:val="pt-ES"/>
-              </w:rPr>
-              <w:t xml:space="preserve"> (backend)</w:t>
-            </w:r>
-            <w:r>
-              <w:rPr>
-                <w:rFonts w:ascii="Times New Roman" w:hAnsi="Times New Roman"/>
-                <w:sz w:val="24"/>
-                <w:szCs w:val="24"/>
-                <w:lang w:val="pt-ES"/>
-              </w:rPr>
-              <w:t xml:space="preserve"> and an Android client application</w:t>
-            </w:r>
-            <w:r>
-              <w:rPr>
-                <w:rFonts w:ascii="Times New Roman" w:hAnsi="Times New Roman"/>
-                <w:sz w:val="24"/>
-                <w:szCs w:val="24"/>
-                <w:lang w:val="pt-ES"/>
-              </w:rPr>
-              <w:t xml:space="preserve"> (frontend)</w:t>
-            </w:r>
-            <w:r>
-              <w:rPr>
-                <w:rFonts w:ascii="Times New Roman" w:hAnsi="Times New Roman"/>
-                <w:sz w:val="24"/>
-                <w:szCs w:val="24"/>
+                <w:sz w:val="20"/>
+                <w:szCs w:val="20"/>
+                <w:lang w:val="pt-ES"/>
+              </w:rPr>
+              <w:t>quality improvement through automated testing</w:t>
+            </w:r>
+            <w:r>
+              <w:rPr>
+                <w:rFonts w:ascii="Times New Roman" w:hAnsi="Times New Roman"/>
+                <w:sz w:val="20"/>
+                <w:szCs w:val="20"/>
+                <w:lang w:val="pt-ES"/>
+              </w:rPr>
+              <w:t xml:space="preserve"> in the API</w:t>
+            </w:r>
+            <w:r>
+              <w:rPr>
+                <w:rFonts w:ascii="Times New Roman" w:hAnsi="Times New Roman"/>
+                <w:sz w:val="20"/>
+                <w:szCs w:val="20"/>
+                <w:lang w:val="pt-ES"/>
+              </w:rPr>
+              <w:t xml:space="preserve">, </w:t>
+            </w:r>
+            <w:r>
+              <w:rPr>
+                <w:rFonts w:ascii="Times New Roman" w:hAnsi="Times New Roman"/>
+                <w:sz w:val="20"/>
+                <w:szCs w:val="20"/>
+                <w:lang w:val="pt-ES"/>
+              </w:rPr>
+              <w:t>and API deployment to cloud environment. The development process follows a hybrid agile approach (weekly Scrum cadence with Kanban flow), using user stories, acceptance criteria, and evidence-based tracking to ensure traceability</w:t>
+            </w:r>
+            <w:r>
+              <w:rPr>
+                <w:rFonts w:ascii="Times New Roman" w:hAnsi="Times New Roman"/>
+                <w:sz w:val="20"/>
+                <w:szCs w:val="20"/>
+                <w:lang w:val="pt-ES"/>
+              </w:rPr>
+              <w:t xml:space="preserve"> and velocity</w:t>
+            </w:r>
+            <w:r>
+              <w:rPr>
+                <w:rFonts w:ascii="Times New Roman" w:hAnsi="Times New Roman"/>
+                <w:sz w:val="20"/>
+                <w:szCs w:val="20"/>
                 <w:lang w:val="pt-ES"/>
               </w:rPr>
               <w:t>.</w:t>
             </w:r>
-            <w:r>
-              <w:rPr>
-                <w:rFonts w:ascii="Times New Roman" w:hAnsi="Times New Roman"/>
-                <w:sz w:val="24"/>
-                <w:szCs w:val="24"/>
-                <w:lang w:val="pt-ES"/>
-              </w:rPr>
-              <w:t xml:space="preserve"> </w:t>
-            </w:r>
-            <w:r>
-              <w:rPr>
-                <w:rFonts w:ascii="Times New Roman" w:hAnsi="Times New Roman"/>
-                <w:sz w:val="24"/>
-                <w:szCs w:val="24"/>
-                <w:lang w:val="pt-ES"/>
-              </w:rPr>
-              <w:t xml:space="preserve">At the current stage, the project focuses on: </w:t>
-            </w:r>
-            <w:r>
-              <w:rPr>
-                <w:rFonts w:ascii="Times New Roman" w:hAnsi="Times New Roman"/>
-                <w:sz w:val="24"/>
-                <w:szCs w:val="24"/>
-                <w:lang w:val="pt-ES"/>
-              </w:rPr>
-              <w:t>completing</w:t>
-            </w:r>
-            <w:r>
-              <w:rPr>
-                <w:rFonts w:ascii="Times New Roman" w:hAnsi="Times New Roman"/>
-                <w:sz w:val="24"/>
-                <w:szCs w:val="24"/>
-                <w:lang w:val="pt-ES"/>
-              </w:rPr>
-              <w:t xml:space="preserve"> </w:t>
-            </w:r>
-            <w:r>
-              <w:rPr>
-                <w:rFonts w:ascii="Times New Roman" w:hAnsi="Times New Roman"/>
-                <w:sz w:val="24"/>
-                <w:szCs w:val="24"/>
-                <w:lang w:val="pt-ES"/>
-              </w:rPr>
-              <w:t xml:space="preserve">the </w:t>
-            </w:r>
-            <w:r>
-              <w:rPr>
-                <w:rFonts w:ascii="Times New Roman" w:hAnsi="Times New Roman"/>
-                <w:sz w:val="24"/>
-                <w:szCs w:val="24"/>
-                <w:lang w:val="pt-ES"/>
-              </w:rPr>
-              <w:t>award</w:t>
-            </w:r>
-            <w:r>
-              <w:rPr>
-                <w:rFonts w:ascii="Times New Roman" w:hAnsi="Times New Roman"/>
-                <w:sz w:val="24"/>
-                <w:szCs w:val="24"/>
-                <w:lang w:val="pt-ES"/>
-              </w:rPr>
-              <w:t xml:space="preserve"> and </w:t>
-            </w:r>
-            <w:r>
-              <w:rPr>
-                <w:rFonts w:ascii="Times New Roman" w:hAnsi="Times New Roman"/>
-                <w:sz w:val="24"/>
-                <w:szCs w:val="24"/>
-                <w:lang w:val="pt-ES"/>
-              </w:rPr>
-              <w:t>notification</w:t>
-            </w:r>
-            <w:r>
-              <w:rPr>
-                <w:rFonts w:ascii="Times New Roman" w:hAnsi="Times New Roman"/>
-                <w:sz w:val="24"/>
-                <w:szCs w:val="24"/>
-                <w:lang w:val="pt-ES"/>
-              </w:rPr>
-              <w:t xml:space="preserve"> </w:t>
-            </w:r>
-            <w:r>
-              <w:rPr>
-                <w:rFonts w:ascii="Times New Roman" w:hAnsi="Times New Roman"/>
-                <w:sz w:val="24"/>
-                <w:szCs w:val="24"/>
-                <w:lang w:val="pt-ES"/>
-              </w:rPr>
-              <w:t>work</w:t>
-            </w:r>
-            <w:r>
-              <w:rPr>
-                <w:rFonts w:ascii="Times New Roman" w:hAnsi="Times New Roman"/>
-                <w:sz w:val="24"/>
-                <w:szCs w:val="24"/>
-                <w:lang w:val="pt-ES"/>
-              </w:rPr>
-              <w:t>flows</w:t>
-            </w:r>
-            <w:r>
-              <w:rPr>
-                <w:rFonts w:ascii="Times New Roman" w:hAnsi="Times New Roman"/>
-                <w:sz w:val="24"/>
-                <w:szCs w:val="24"/>
-                <w:lang w:val="pt-ES"/>
-              </w:rPr>
-              <w:t>;</w:t>
-            </w:r>
-            <w:r>
-              <w:rPr>
-                <w:rFonts w:ascii="Times New Roman" w:hAnsi="Times New Roman"/>
-                <w:sz w:val="24"/>
-                <w:szCs w:val="24"/>
-                <w:lang w:val="pt-ES"/>
-              </w:rPr>
-              <w:t xml:space="preserve"> </w:t>
-            </w:r>
-            <w:r>
-              <w:rPr>
-                <w:rFonts w:ascii="Times New Roman" w:hAnsi="Times New Roman"/>
-                <w:sz w:val="24"/>
-                <w:szCs w:val="24"/>
-                <w:lang w:val="pt-ES"/>
-              </w:rPr>
-              <w:t>Android refactoring according to software engineering patterns</w:t>
-            </w:r>
-            <w:r>
-              <w:rPr>
-                <w:rFonts w:ascii="Times New Roman" w:hAnsi="Times New Roman"/>
-                <w:sz w:val="24"/>
-                <w:szCs w:val="24"/>
-                <w:lang w:val="pt-ES"/>
-              </w:rPr>
-              <w:t xml:space="preserve">, </w:t>
-            </w:r>
-            <w:r>
-              <w:rPr>
-                <w:rFonts w:ascii="Times New Roman" w:hAnsi="Times New Roman"/>
-                <w:sz w:val="24"/>
-                <w:szCs w:val="24"/>
-                <w:lang w:val="pt-ES"/>
-              </w:rPr>
-              <w:t>quality improvement through automated testing</w:t>
-            </w:r>
-            <w:r>
-              <w:rPr>
-                <w:rFonts w:ascii="Times New Roman" w:hAnsi="Times New Roman"/>
-                <w:sz w:val="24"/>
-                <w:szCs w:val="24"/>
-                <w:lang w:val="pt-ES"/>
-              </w:rPr>
-              <w:t xml:space="preserve"> in the API</w:t>
-            </w:r>
-            <w:r>
-              <w:rPr>
-                <w:rFonts w:ascii="Times New Roman" w:hAnsi="Times New Roman"/>
-                <w:sz w:val="24"/>
-                <w:szCs w:val="24"/>
-                <w:lang w:val="pt-ES"/>
-              </w:rPr>
-              <w:t xml:space="preserve">, </w:t>
-            </w:r>
-            <w:r>
-              <w:rPr>
-                <w:rFonts w:ascii="Times New Roman" w:hAnsi="Times New Roman"/>
-                <w:sz w:val="24"/>
-                <w:szCs w:val="24"/>
-                <w:lang w:val="pt-ES"/>
-              </w:rPr>
-              <w:t>and API deployment to cloud environment. The development process follows a hybrid agile approach (weekly Scrum cadence with Kanban flow), using user stories, acceptance criteria, and evidence-based tracking to ensure traceability</w:t>
-            </w:r>
-            <w:r>
-              <w:rPr>
-                <w:rFonts w:ascii="Times New Roman" w:hAnsi="Times New Roman"/>
-                <w:sz w:val="24"/>
-                <w:szCs w:val="24"/>
-                <w:lang w:val="pt-ES"/>
-              </w:rPr>
-              <w:t xml:space="preserve"> and velocity</w:t>
-            </w:r>
-            <w:r>
-              <w:rPr>
-                <w:rFonts w:ascii="Times New Roman" w:hAnsi="Times New Roman"/>
-                <w:sz w:val="24"/>
-                <w:szCs w:val="24"/>
-                <w:lang w:val="pt-ES"/>
-              </w:rPr>
-              <w:t>.</w:t>
-            </w:r>
-          </w:p>
-          <w:p>
-            <w:pPr>
-              <w:widowControl w:val="0"/>
-              <w:autoSpaceDE w:val="0"/>
-              <w:autoSpaceDN w:val="0"/>
-              <w:adjustRightInd w:val="0"/>
-              <w:spacing w:after="0" w:line="200" w:lineRule="exact"/>
-              <w:rPr>
-                <w:rFonts w:ascii="Times New Roman" w:hAnsi="Times New Roman"/>
-                <w:sz w:val="24"/>
-                <w:szCs w:val="24"/>
-                <w:lang w:val="pt-ES"/>
-              </w:rPr>
-            </w:pPr>
           </w:p>
         </w:tc>
       </w:tr>
@@ -2254,12 +1724,14 @@
         </w:trPr>
         <w:tc>
           <w:tcPr>
-            <w:tcW w:w="2235" w:type="dxa"/>
+            <w:tcW w:w="2122" w:type="dxa"/>
             <w:vMerge/>
+            <w:vAlign w:val="center"/>
           </w:tcPr>
           <w:p>
             <w:pPr>
               <w:pStyle w:val="Texto"/>
+              <w:jc w:val="both"/>
               <w:rPr>
                 <w:b/>
                 <w:lang w:val="pt-ES"/>
@@ -2269,7 +1741,8 @@
         </w:tc>
         <w:tc>
           <w:tcPr>
-            <w:tcW w:w="3572" w:type="dxa"/>
+            <w:tcW w:w="3685" w:type="dxa"/>
+            <w:vAlign w:val="center"/>
           </w:tcPr>
           <w:p>
             <w:pPr>
@@ -2277,20 +1750,21 @@
               <w:autoSpaceDE w:val="0"/>
               <w:autoSpaceDN w:val="0"/>
               <w:adjustRightInd w:val="0"/>
-              <w:spacing w:after="0" w:line="200" w:lineRule="exact"/>
+              <w:spacing w:after="0" w:line="240" w:lineRule="auto"/>
+              <w:jc w:val="both"/>
               <w:rPr>
                 <w:rFonts w:ascii="Times New Roman" w:hAnsi="Times New Roman"/>
                 <w:b/>
-                <w:sz w:val="24"/>
-                <w:szCs w:val="24"/>
+                <w:sz w:val="20"/>
+                <w:szCs w:val="20"/>
               </w:rPr>
             </w:pPr>
             <w:r>
               <w:rPr>
                 <w:rFonts w:ascii="Times New Roman" w:hAnsi="Times New Roman"/>
                 <w:b/>
-                <w:sz w:val="24"/>
-                <w:szCs w:val="24"/>
+                <w:sz w:val="20"/>
+                <w:szCs w:val="20"/>
                 <w:lang w:val="es-ES"/>
               </w:rPr>
               <w:t>Palabras clave</w:t>
@@ -2299,66 +1773,37 @@
               <w:rPr>
                 <w:rFonts w:ascii="Times New Roman" w:hAnsi="Times New Roman"/>
                 <w:b/>
-                <w:sz w:val="24"/>
-                <w:szCs w:val="24"/>
-                <w:lang w:val="es-ES"/>
-              </w:rPr>
-              <w:t>: I</w:t>
+                <w:sz w:val="20"/>
+                <w:szCs w:val="20"/>
+                <w:lang w:val="es-ES"/>
+              </w:rPr>
+              <w:t xml:space="preserve">: Ingeniería Web, Android, API REST, </w:t>
             </w:r>
             <w:r>
               <w:rPr>
                 <w:rFonts w:ascii="Times New Roman" w:hAnsi="Times New Roman"/>
                 <w:b/>
-                <w:sz w:val="24"/>
-                <w:szCs w:val="24"/>
-                <w:lang w:val="es-ES"/>
-              </w:rPr>
-              <w:t xml:space="preserve">ngeniería Web, Android, API REST, </w:t>
+                <w:sz w:val="20"/>
+                <w:szCs w:val="20"/>
+              </w:rPr>
+              <w:t>refactoring</w:t>
             </w:r>
             <w:r>
               <w:rPr>
                 <w:rFonts w:ascii="Times New Roman" w:hAnsi="Times New Roman"/>
                 <w:b/>
-                <w:sz w:val="24"/>
-                <w:szCs w:val="24"/>
-              </w:rPr>
-              <w:t>refactoring</w:t>
-            </w:r>
-            <w:r>
-              <w:rPr>
-                <w:rFonts w:ascii="Times New Roman" w:hAnsi="Times New Roman"/>
-                <w:b/>
-                <w:sz w:val="24"/>
-                <w:szCs w:val="24"/>
-                <w:lang w:val="es-ES"/>
-              </w:rPr>
-              <w:t xml:space="preserve">, calidad de software, despliegue </w:t>
-            </w:r>
-            <w:r>
-              <w:rPr>
-                <w:rFonts w:ascii="Times New Roman" w:hAnsi="Times New Roman"/>
-                <w:b/>
-                <w:sz w:val="24"/>
-                <w:szCs w:val="24"/>
-                <w:lang w:val="es-ES"/>
-              </w:rPr>
-              <w:t>en la nube</w:t>
-            </w:r>
-            <w:r>
-              <w:rPr>
-                <w:rFonts w:ascii="Times New Roman" w:hAnsi="Times New Roman"/>
-                <w:b/>
-                <w:sz w:val="24"/>
-                <w:szCs w:val="24"/>
-                <w:lang w:val="es-ES"/>
-              </w:rPr>
-              <w:t xml:space="preserve">  </w:t>
+                <w:sz w:val="20"/>
+                <w:szCs w:val="20"/>
+                <w:lang w:val="es-ES"/>
+              </w:rPr>
+              <w:t xml:space="preserve">, calidad de software, despliegue en la nube  </w:t>
             </w:r>
           </w:p>
         </w:tc>
         <w:tc>
           <w:tcPr>
             <w:tcW w:w="3940" w:type="dxa"/>
+            <w:vAlign w:val="center"/>
           </w:tcPr>
           <w:p>
             <w:pPr>
@@ -2366,20 +1811,21 @@
               <w:autoSpaceDE w:val="0"/>
               <w:autoSpaceDN w:val="0"/>
               <w:adjustRightInd w:val="0"/>
-              <w:spacing w:after="0" w:line="200" w:lineRule="exact"/>
+              <w:spacing w:after="0" w:line="240" w:lineRule="auto"/>
+              <w:jc w:val="both"/>
               <w:rPr>
                 <w:rFonts w:ascii="Times New Roman" w:hAnsi="Times New Roman"/>
                 <w:b/>
-                <w:sz w:val="24"/>
-                <w:szCs w:val="24"/>
+                <w:sz w:val="20"/>
+                <w:szCs w:val="20"/>
               </w:rPr>
             </w:pPr>
             <w:r>
               <w:rPr>
                 <w:rFonts w:ascii="Times New Roman" w:hAnsi="Times New Roman"/>
                 <w:b/>
-                <w:sz w:val="24"/>
-                <w:szCs w:val="24"/>
+                <w:sz w:val="20"/>
+                <w:szCs w:val="20"/>
               </w:rPr>
               <w:t>Keywords</w:t>
             </w:r>
@@ -2387,8 +1833,8 @@
               <w:rPr>
                 <w:rFonts w:ascii="Times New Roman" w:hAnsi="Times New Roman"/>
                 <w:b/>
-                <w:sz w:val="24"/>
-                <w:szCs w:val="24"/>
+                <w:sz w:val="20"/>
+                <w:szCs w:val="20"/>
               </w:rPr>
               <w:t>: Web Engineering, Android, REST API, refactoring, software quality, cloud deployment</w:t>
             </w:r>
@@ -2397,15 +1843,17 @@
       </w:tr>
       <w:tr>
         <w:trPr>
-          <w:trHeight w:val="2525"/>
+          <w:trHeight w:val="2176"/>
         </w:trPr>
         <w:tc>
           <w:tcPr>
-            <w:tcW w:w="2235" w:type="dxa"/>
+            <w:tcW w:w="2122" w:type="dxa"/>
+            <w:vAlign w:val="center"/>
           </w:tcPr>
           <w:p>
             <w:pPr>
               <w:pStyle w:val="Texto"/>
+              <w:jc w:val="both"/>
               <w:rPr>
                 <w:b/>
                 <w:lang w:val="es-ES"/>
@@ -2422,11 +1870,13 @@
         </w:tc>
         <w:tc>
           <w:tcPr>
-            <w:tcW w:w="3572" w:type="dxa"/>
+            <w:tcW w:w="3685" w:type="dxa"/>
+            <w:vAlign w:val="center"/>
           </w:tcPr>
           <w:p>
             <w:pPr>
               <w:pStyle w:val="Texto"/>
+              <w:jc w:val="both"/>
               <w:rPr>
                 <w:b/>
                 <w:lang w:val="es-ES"/>
@@ -2450,13 +1900,22 @@
           <w:p>
             <w:pPr>
               <w:pStyle w:val="Texto"/>
+              <w:jc w:val="both"/>
               <w:rPr>
                 <w:lang w:val="es-ES"/>
               </w:rPr>
             </w:pPr>
-            <w:r>
-              <w:rPr>
-                <w:b/>
+          </w:p>
+          <w:p>
+            <w:pPr>
+              <w:pStyle w:val="Texto"/>
+              <w:jc w:val="both"/>
+              <w:rPr>
+                <w:lang w:val="es-ES"/>
+              </w:rPr>
+            </w:pPr>
+            <w:r>
+              <w:rPr>
                 <w:lang w:val="es-ES"/>
               </w:rPr>
               <w:br/>
@@ -2465,46 +1924,41 @@
               <w:rPr>
                 <w:lang w:val="es-ES"/>
               </w:rPr>
+              <w:t>Vº</w:t>
+            </w:r>
+            <w:r>
+              <w:rPr>
+                <w:lang w:val="es-ES"/>
+              </w:rPr>
+              <w:t> </w:t>
+            </w:r>
+            <w:r>
+              <w:rPr>
+                <w:lang w:val="es-ES"/>
+              </w:rPr>
+              <w:t>Bº Tutor</w:t>
+            </w:r>
+            <w:r>
+              <w:rPr>
+                <w:lang w:val="es-ES"/>
+              </w:rPr>
               <w:br/>
             </w:r>
             <w:r>
               <w:rPr>
                 <w:lang w:val="es-ES"/>
               </w:rPr>
-              <w:t>Vº</w:t>
-            </w:r>
-            <w:r>
-              <w:rPr>
-                <w:lang w:val="es-ES"/>
-              </w:rPr>
-              <w:t> </w:t>
-            </w:r>
-            <w:r>
-              <w:rPr>
-                <w:lang w:val="es-ES"/>
-              </w:rPr>
-              <w:t>Bº Tutor</w:t>
-            </w:r>
-            <w:r>
-              <w:rPr>
-                <w:lang w:val="es-ES"/>
-              </w:rPr>
               <w:br/>
             </w:r>
-            <w:r>
-              <w:rPr>
-                <w:sz w:val="24"/>
-                <w:szCs w:val="24"/>
-                <w:lang w:val="es-ES"/>
-              </w:rPr>
-              <w:br/>
-            </w:r>
-            <w:r>
-              <w:rPr>
-                <w:lang w:val="es-ES"/>
-              </w:rPr>
-              <w:br/>
-            </w:r>
+          </w:p>
+          <w:p>
+            <w:pPr>
+              <w:pStyle w:val="Texto"/>
+              <w:jc w:val="both"/>
+              <w:rPr>
+                <w:lang w:val="es-ES"/>
+              </w:rPr>
+            </w:pPr>
             <w:r>
               <w:rPr>
                 <w:lang w:val="es-ES"/>
@@ -2522,10 +1976,12 @@
         <w:tc>
           <w:tcPr>
             <w:tcW w:w="3940" w:type="dxa"/>
+            <w:vAlign w:val="center"/>
           </w:tcPr>
           <w:p>
             <w:pPr>
               <w:pStyle w:val="Texto"/>
+              <w:jc w:val="both"/>
               <w:rPr>
                 <w:b/>
                 <w:lang w:val="es-ES"/>
@@ -2549,12 +2005,20 @@
           <w:p>
             <w:pPr>
               <w:pStyle w:val="Texto"/>
-              <w:rPr>
-                <w:sz w:val="24"/>
-                <w:szCs w:val="24"/>
+              <w:jc w:val="both"/>
+              <w:rPr>
                 <w:lang w:val="es-ES"/>
               </w:rPr>
             </w:pPr>
+          </w:p>
+          <w:p>
+            <w:pPr>
+              <w:pStyle w:val="Texto"/>
+              <w:jc w:val="both"/>
+              <w:rPr>
+                <w:lang w:val="es-ES"/>
+              </w:rPr>
+            </w:pPr>
             <w:r>
               <w:rPr>
                 <w:lang w:val="es-ES"/>
@@ -2565,25 +2029,31 @@
               <w:rPr>
                 <w:lang w:val="es-ES"/>
               </w:rPr>
+              <w:t>Vº </w:t>
+            </w:r>
+            <w:r>
+              <w:rPr>
+                <w:lang w:val="es-ES"/>
+              </w:rPr>
+              <w:t xml:space="preserve">Bº </w:t>
+            </w:r>
+            <w:r>
+              <w:rPr>
+                <w:lang w:val="es-ES"/>
+              </w:rPr>
+              <w:t>Presidente de la</w:t>
+            </w:r>
+            <w:r>
+              <w:rPr>
+                <w:lang w:val="es-ES"/>
+              </w:rPr>
               <w:br/>
             </w:r>
             <w:r>
               <w:rPr>
                 <w:lang w:val="es-ES"/>
               </w:rPr>
-              <w:t>Vº </w:t>
-            </w:r>
-            <w:r>
-              <w:rPr>
-                <w:lang w:val="es-ES"/>
-              </w:rPr>
-              <w:t xml:space="preserve">Bº </w:t>
-            </w:r>
-            <w:r>
-              <w:rPr>
-                <w:lang w:val="es-ES"/>
-              </w:rPr>
-              <w:t>Presidente de la</w:t>
+              <w:t>Comisión Académica de Postgrado</w:t>
             </w:r>
             <w:r>
               <w:rPr>
@@ -2591,24 +2061,15 @@
               </w:rPr>
               <w:br/>
             </w:r>
-            <w:r>
-              <w:rPr>
-                <w:lang w:val="es-ES"/>
-              </w:rPr>
-              <w:t>Comisión Académica de Postgrado</w:t>
-            </w:r>
-            <w:r>
-              <w:rPr>
-                <w:lang w:val="es-ES"/>
-              </w:rPr>
-              <w:br/>
-            </w:r>
-            <w:r>
-              <w:rPr>
-                <w:lang w:val="es-ES"/>
-              </w:rPr>
-              <w:br/>
-            </w:r>
+          </w:p>
+          <w:p>
+            <w:pPr>
+              <w:pStyle w:val="Texto"/>
+              <w:jc w:val="both"/>
+              <w:rPr>
+                <w:lang w:val="es-ES"/>
+              </w:rPr>
+            </w:pPr>
             <w:r>
               <w:rPr>
                 <w:lang w:val="es-ES"/>
@@ -2631,11 +2092,10 @@
         <w:autoSpaceDE w:val="0"/>
         <w:autoSpaceDN w:val="0"/>
         <w:adjustRightInd w:val="0"/>
-        <w:spacing w:after="0" w:line="200" w:lineRule="exact"/>
+        <w:spacing w:after="0" w:line="240" w:lineRule="auto"/>
+        <w:jc w:val="both"/>
         <w:rPr>
           <w:rFonts w:ascii="Times New Roman" w:hAnsi="Times New Roman"/>
-          <w:sz w:val="24"/>
-          <w:szCs w:val="24"/>
           <w:lang w:val="es-ES"/>
         </w:rPr>
       </w:pPr>
@@ -2727,7 +2187,7 @@
           <wp:extent cx="7447915" cy="766445"/>
           <wp:effectExtent l="0" t="0" r="635" b="0"/>
           <wp:wrapSquare wrapText="bothSides"/>
-          <wp:docPr id="32" name="Imagen 32"/>
+          <wp:docPr id="1609965816" name="Imagen 32"/>
           <wp:cNvGraphicFramePr>
             <a:graphicFrameLocks xmlns:a="http://schemas.openxmlformats.org/drawingml/2006/main" noChangeAspect="1"/>
           </wp:cNvGraphicFramePr>
@@ -2805,7 +2265,7 @@
           <wp:extent cx="2856865" cy="977900"/>
           <wp:effectExtent l="0" t="0" r="0" b="0"/>
           <wp:wrapSquare wrapText="bothSides"/>
-          <wp:docPr id="30" name="0 Imagen"/>
+          <wp:docPr id="1762025728" name="0 Imagen"/>
           <wp:cNvGraphicFramePr>
             <a:graphicFrameLocks xmlns:a="http://schemas.openxmlformats.org/drawingml/2006/main" noChangeAspect="1"/>
           </wp:cNvGraphicFramePr>
@@ -2866,7 +2326,7 @@
           <wp:extent cx="1711325" cy="1071880"/>
           <wp:effectExtent l="0" t="0" r="3175" b="0"/>
           <wp:wrapSquare wrapText="bothSides"/>
-          <wp:docPr id="31" name="0 Imagen"/>
+          <wp:docPr id="270133318" name="0 Imagen"/>
           <wp:cNvGraphicFramePr>
             <a:graphicFrameLocks xmlns:a="http://schemas.openxmlformats.org/drawingml/2006/main" noChangeAspect="1"/>
           </wp:cNvGraphicFramePr>

</xml_diff>